<commit_message>
docs: estrutura e revisa as falas novas das cenas 1.3 e 1.7 do Roteiro
Co-Authored-By: Claude Sonnet 5.5 <noreply@anthropic.com>
</commit_message>
<xml_diff>
--- a/docs/historia/roteiro/Roteiro.docx
+++ b/docs/historia/roteiro/Roteiro.docx
@@ -126,7 +126,7 @@
           </w:tcPr>
           <w:p>
             <w:r>
-              <w:t xml:space="preserve">0.2 — Rascunho</w:t>
+              <w:t xml:space="preserve">0.3 — Rascunho</w:t>
             </w:r>
           </w:p>
         </w:tc>
@@ -2875,6 +2875,15 @@
     <w:p>
       <w:pPr>
         <w:pStyle w:val="NotaTime"/>
+        <w:spacing w:after="100"/>
+      </w:pPr>
+      <w:r>
+        <w:t xml:space="preserve">Falas novas, escritas no roteiro e ainda fora do jogo, aparecem com uma barra azul à esquerda.</w:t>
+      </w:r>
+    </w:p>
+    <w:p>
+      <w:pPr>
+        <w:pStyle w:val="NotaTime"/>
         <w:spacing w:after="160"/>
       </w:pPr>
       <w:r>
@@ -9714,7 +9723,7 @@
               <w:keepNext/>
             </w:pPr>
             <w:r>
-              <w:t xml:space="preserve">Rádio</w:t>
+              <w:t xml:space="preserve">Rádio, com respostas do Gabriel</w:t>
             </w:r>
           </w:p>
         </w:tc>
@@ -9766,7 +9775,7 @@
               <w:keepNext/>
             </w:pPr>
             <w:r>
-              <w:t xml:space="preserve">No jogo</w:t>
+              <w:t xml:space="preserve">No jogo, com falas novas em rascunho</w:t>
             </w:r>
           </w:p>
         </w:tc>
@@ -9808,7 +9817,7 @@
         <w:spacing w:after="60"/>
       </w:pPr>
       <w:r>
-        <w:t xml:space="preserve">Transmissão clarice_biblioteca_01  (dados/transmissoes/clarice_biblioteca_01.tres)</w:t>
+        <w:t xml:space="preserve">Transmissão clarice_biblioteca_01  (dados/transmissoes/clarice_biblioteca_01.tres), com falas novas do roteiro</w:t>
       </w:r>
     </w:p>
     <w:p>
@@ -9861,10 +9870,50 @@
     </w:p>
     <w:p>
       <w:pPr>
-        <w:pStyle w:val="Dialogo"/>
-      </w:pPr>
-      <w:r>
-        <w:t xml:space="preserve">Eu fico na escuta. Qualquer coisa, chama. E não confia nas luzes.</w:t>
+        <w:pStyle w:val="PersonagemNovo"/>
+      </w:pPr>
+      <w:r>
+        <w:t xml:space="preserve">GABRIEL (RÁDIO)</w:t>
+      </w:r>
+    </w:p>
+    <w:p>
+      <w:pPr>
+        <w:pStyle w:val="DialogoNovo"/>
+      </w:pPr>
+      <w:r>
+        <w:t xml:space="preserve">Peraí, o que tá acontecendo? Isso é algum tipo de brincadeira? Olha, eu preciso ir pra casa, tenho muito trabalho pra fazer da faculdade, não tô no clima.</w:t>
+      </w:r>
+    </w:p>
+    <w:p>
+      <w:pPr>
+        <w:pStyle w:val="PersonagemNovo"/>
+      </w:pPr>
+      <w:r>
+        <w:t xml:space="preserve">CLARICE (RÁDIO)</w:t>
+      </w:r>
+    </w:p>
+    <w:p>
+      <w:pPr>
+        <w:pStyle w:val="DialogoNovo"/>
+      </w:pPr>
+      <w:r>
+        <w:t xml:space="preserve">Ah, entendo. Olha, eu vou explicar tudo, mas preciso que você saia daí e venha me encontrar. Sei que parece loucura, mas não foi só você. Enfim, qualquer coisa me avisa por aqui. Até logo.</w:t>
+      </w:r>
+    </w:p>
+    <w:p>
+      <w:pPr>
+        <w:pStyle w:val="PersonagemNovo"/>
+      </w:pPr>
+      <w:r>
+        <w:t xml:space="preserve">GABRIEL</w:t>
+      </w:r>
+    </w:p>
+    <w:p>
+      <w:pPr>
+        <w:pStyle w:val="DialogoNovo"/>
+      </w:pPr>
+      <w:r>
+        <w:t xml:space="preserve">Espera… Que loucura é essa? Ah, desligou.</w:t>
       </w:r>
     </w:p>
     <w:p>
@@ -9932,6 +9981,42 @@
       </w:r>
       <w:r>
         <w:t xml:space="preserve">Sem o rádio, nenhuma transmissão toca. O jogador aprende que os robôs têm rotina e avisos, e que existe alguém do outro lado.</w:t>
+      </w:r>
+    </w:p>
+    <w:p>
+      <w:pPr>
+        <w:pStyle w:val="NotaTime"/>
+        <w:spacing w:after="60" w:before="60"/>
+      </w:pPr>
+      <w:r>
+        <w:t xml:space="preserve">Nota: Linhas com barra azul à esquerda são suas e ainda não estão no jogo. As outras já tocam.</w:t>
+      </w:r>
+    </w:p>
+    <w:p>
+      <w:pPr>
+        <w:pStyle w:val="NotaTime"/>
+        <w:spacing w:after="60" w:before="60"/>
+      </w:pPr>
+      <w:r>
+        <w:t xml:space="preserve">Nota: Só a escrita foi corrigida: Clarisse virou Clarice, e ajustei “peraí”, “casa”, “tô”, “daí” e a pontuação. O sentido ficou como você escreveu.</w:t>
+      </w:r>
+    </w:p>
+    <w:p>
+      <w:pPr>
+        <w:pStyle w:val="NotaTime"/>
+        <w:spacing w:after="60" w:before="60"/>
+      </w:pPr>
+      <w:r>
+        <w:t xml:space="preserve">Nota: Sumiu do seu texto a última fala da Clarice que já toca no jogo: “Eu fico na escuta. Qualquer coisa, chama. E não confia nas luzes.” Foi de propósito?</w:t>
+      </w:r>
+    </w:p>
+    <w:p>
+      <w:pPr>
+        <w:pStyle w:val="NotaTime"/>
+        <w:spacing w:after="60" w:before="60"/>
+      </w:pPr>
+      <w:r>
+        <w:t xml:space="preserve">Nota: No jogo, o rádio não tem resposta do Gabriel e não pausa. Ver o Anexo B, item 1.</w:t>
       </w:r>
     </w:p>
     <w:p>
@@ -10930,7 +11015,7 @@
               <w:keepNext/>
             </w:pPr>
             <w:r>
-              <w:t xml:space="preserve">Rádio</w:t>
+              <w:t xml:space="preserve">Rádio (telefone), com respostas do Gabriel</w:t>
             </w:r>
           </w:p>
         </w:tc>
@@ -10982,7 +11067,7 @@
               <w:keepNext/>
             </w:pPr>
             <w:r>
-              <w:t xml:space="preserve">No jogo</w:t>
+              <w:t xml:space="preserve">No jogo, com falas novas em rascunho</w:t>
             </w:r>
           </w:p>
         </w:tc>
@@ -11024,7 +11109,7 @@
         <w:spacing w:after="60"/>
       </w:pPr>
       <w:r>
-        <w:t xml:space="preserve">Transmissão zane_01  (dados/transmissoes/zane_01.tres)</w:t>
+        <w:t xml:space="preserve">Transmissão zane_01  (dados/transmissoes/zane_01.tres), com falas novas do roteiro</w:t>
       </w:r>
     </w:p>
     <w:p>
@@ -11045,10 +11130,122 @@
     </w:p>
     <w:p>
       <w:pPr>
+        <w:pStyle w:val="PersonagemNovo"/>
+      </w:pPr>
+      <w:r>
+        <w:t xml:space="preserve">GABRIEL (TELEFONE)</w:t>
+      </w:r>
+    </w:p>
+    <w:p>
+      <w:pPr>
+        <w:pStyle w:val="DialogoNovo"/>
+      </w:pPr>
+      <w:r>
+        <w:t xml:space="preserve">Alô, meu nome é Gabriel. Olha, você pode me explicar o que é tudo isso? Esses robôs são de verdade? Que lugar é esse? Como isso aconteceu?</w:t>
+      </w:r>
+    </w:p>
+    <w:p>
+      <w:pPr>
+        <w:pStyle w:val="PersonagemNovo"/>
+      </w:pPr>
+      <w:r>
+        <w:t xml:space="preserve">ZANE (TELEFONE)</w:t>
+      </w:r>
+    </w:p>
+    <w:p>
+      <w:pPr>
+        <w:pStyle w:val="DialogoNovo"/>
+      </w:pPr>
+      <w:r>
+        <w:t xml:space="preserve">Eu sei que parece brincadeira, mas infelizmente não. A Clarice vai te explicar quando você chegar até ela.</w:t>
+      </w:r>
+    </w:p>
+    <w:p>
+      <w:pPr>
+        <w:pStyle w:val="Personagem"/>
+      </w:pPr>
+      <w:r>
+        <w:t xml:space="preserve">ZANE (TELEFONE)</w:t>
+      </w:r>
+    </w:p>
+    <w:p>
+      <w:pPr>
         <w:pStyle w:val="Dialogo"/>
       </w:pPr>
       <w:r>
-        <w:t xml:space="preserve">Não desliga. O sistema acusou a grade da ala leste subindo. Foi você, né?</w:t>
+        <w:t xml:space="preserve">Achou o disquete da Clarice? Ela guarda senha em tudo. Pré-histórico, mas funciona.</w:t>
+      </w:r>
+    </w:p>
+    <w:p>
+      <w:pPr>
+        <w:pStyle w:val="PersonagemNovo"/>
+      </w:pPr>
+      <w:r>
+        <w:t xml:space="preserve">GABRIEL (TELEFONE)</w:t>
+      </w:r>
+    </w:p>
+    <w:p>
+      <w:pPr>
+        <w:pStyle w:val="DialogoNovo"/>
+      </w:pPr>
+      <w:r>
+        <w:t xml:space="preserve">Achei, sim. Fazia tempo que não via um desses.</w:t>
+      </w:r>
+    </w:p>
+    <w:p>
+      <w:pPr>
+        <w:pStyle w:val="PersonagemNovo"/>
+      </w:pPr>
+      <w:r>
+        <w:t xml:space="preserve">ZANE (TELEFONE)</w:t>
+      </w:r>
+    </w:p>
+    <w:p>
+      <w:pPr>
+        <w:pStyle w:val="DialogoNovo"/>
+      </w:pPr>
+      <w:r>
+        <w:t xml:space="preserve">Eu só vi em museu. No meu tempo só restam lembranças disso.</w:t>
+      </w:r>
+    </w:p>
+    <w:p>
+      <w:pPr>
+        <w:pStyle w:val="PersonagemNovo"/>
+      </w:pPr>
+      <w:r>
+        <w:t xml:space="preserve">GABRIEL (TELEFONE)</w:t>
+      </w:r>
+    </w:p>
+    <w:p>
+      <w:pPr>
+        <w:pStyle w:val="DialogoNovo"/>
+      </w:pPr>
+      <w:r>
+        <w:t xml:space="preserve">Como assim, seu tempo?</w:t>
+      </w:r>
+    </w:p>
+    <w:p>
+      <w:pPr>
+        <w:pStyle w:val="PersonagemNovo"/>
+      </w:pPr>
+      <w:r>
+        <w:t xml:space="preserve">ZANE (TELEFONE)</w:t>
+      </w:r>
+    </w:p>
+    <w:p>
+      <w:pPr>
+        <w:pStyle w:val="DialogoNovo"/>
+      </w:pPr>
+      <w:r>
+        <w:t xml:space="preserve">[continuando]</w:t>
+      </w:r>
+    </w:p>
+    <w:p>
+      <w:pPr>
+        <w:pStyle w:val="Personagem"/>
+      </w:pPr>
+      <w:r>
+        <w:t xml:space="preserve">ZANE (TELEFONE)</w:t>
       </w:r>
     </w:p>
     <w:p>
@@ -11056,7 +11253,7 @@
         <w:pStyle w:val="Dialogo"/>
       </w:pPr>
       <w:r>
-        <w:t xml:space="preserve">Achou o disquete da Clarice? Ela guarda senha em tudo. Pré-histórico, mas funciona.</w:t>
+        <w:t xml:space="preserve">A porta do fim da ala leste é eletrônica. Segura aí... Pronto. Destranquei.</w:t>
       </w:r>
     </w:p>
     <w:p>
@@ -11064,15 +11261,23 @@
         <w:pStyle w:val="Dialogo"/>
       </w:pPr>
       <w:r>
-        <w:t xml:space="preserve">A porta do fim da ala leste é eletrônica. Segura aí... Pronto. Destranquei.</w:t>
-      </w:r>
-    </w:p>
-    <w:p>
-      <w:pPr>
-        <w:pStyle w:val="Dialogo"/>
-      </w:pPr>
-      <w:r>
         <w:t xml:space="preserve">Eu sou o Zane. Agora sai da Biblioteca. E não fica embaixo das luzes, sério. Fui!</w:t>
+      </w:r>
+    </w:p>
+    <w:p>
+      <w:pPr>
+        <w:pStyle w:val="PersonagemNovo"/>
+      </w:pPr>
+      <w:r>
+        <w:t xml:space="preserve">GABRIEL</w:t>
+      </w:r>
+    </w:p>
+    <w:p>
+      <w:pPr>
+        <w:pStyle w:val="DialogoNovo"/>
+      </w:pPr>
+      <w:r>
+        <w:t xml:space="preserve">Espera! Ah, tinha que ser. Bem que poderia ser uma pegadinha, mas essa tá bem feita.</w:t>
       </w:r>
     </w:p>
     <w:p>
@@ -11128,6 +11333,42 @@
       </w:r>
       <w:r>
         <w:t xml:space="preserve">Sair pela ala leste rumo ao Bloco de salas.</w:t>
+      </w:r>
+    </w:p>
+    <w:p>
+      <w:pPr>
+        <w:pStyle w:val="NotaTime"/>
+        <w:spacing w:after="60" w:before="60"/>
+      </w:pPr>
+      <w:r>
+        <w:t xml:space="preserve">Nota: Linhas com barra azul à esquerda são suas e ainda não estão no jogo. As outras já tocam.</w:t>
+      </w:r>
+    </w:p>
+    <w:p>
+      <w:pPr>
+        <w:pStyle w:val="NotaTime"/>
+        <w:spacing w:after="60" w:before="60"/>
+      </w:pPr>
+      <w:r>
+        <w:t xml:space="preserve">Nota: Só a escrita foi corrigida: Clarisse virou Clarice, e ajustei “alô”, “Gabriel”, “restam” e a pontuação. O sentido ficou como você escreveu.</w:t>
+      </w:r>
+    </w:p>
+    <w:p>
+      <w:pPr>
+        <w:pStyle w:val="NotaTime"/>
+        <w:spacing w:after="60" w:before="60"/>
+      </w:pPr>
+      <w:r>
+        <w:t xml:space="preserve">Nota: Sumiu do seu texto a fala do Zane: “Não desliga. O sistema acusou a grade da ala leste subindo. Foi você, né?”. Foi de propósito?</w:t>
+      </w:r>
+    </w:p>
+    <w:p>
+      <w:pPr>
+        <w:pStyle w:val="NotaTime"/>
+        <w:spacing w:after="60" w:before="60"/>
+      </w:pPr>
+      <w:r>
+        <w:t xml:space="preserve">Nota: “[continuando]” é uma fala do Zane que você deixou para escrever depois. Ver o Anexo B, item 5.</w:t>
       </w:r>
     </w:p>
     <w:p>
@@ -11448,10 +11689,10 @@
         </w:tblBorders>
       </w:tblPr>
       <w:tblGrid>
-        <w:gridCol w:w="2400"/>
+        <w:gridCol w:w="2300"/>
         <w:gridCol w:w="1200"/>
-        <w:gridCol w:w="900"/>
-        <w:gridCol w:w="2100"/>
+        <w:gridCol w:w="1100"/>
+        <w:gridCol w:w="2000"/>
         <w:gridCol w:w="2426"/>
       </w:tblGrid>
       <w:tr>
@@ -11460,7 +11701,7 @@
         </w:trPr>
         <w:tc>
           <w:tcPr>
-            <w:tcW w:type="dxa" w:w="2400"/>
+            <w:tcW w:type="dxa" w:w="2300"/>
             <w:tcBorders>
               <w:top w:val="single" w:color="BFC9D1" w:sz="4"/>
               <w:left w:val="single" w:color="BFC9D1" w:sz="4"/>
@@ -11518,7 +11759,7 @@
         </w:tc>
         <w:tc>
           <w:tcPr>
-            <w:tcW w:type="dxa" w:w="900"/>
+            <w:tcW w:type="dxa" w:w="1100"/>
             <w:tcBorders>
               <w:top w:val="single" w:color="BFC9D1" w:sz="4"/>
               <w:left w:val="single" w:color="BFC9D1" w:sz="4"/>
@@ -11547,7 +11788,7 @@
         </w:tc>
         <w:tc>
           <w:tcPr>
-            <w:tcW w:type="dxa" w:w="2100"/>
+            <w:tcW w:type="dxa" w:w="2000"/>
             <w:tcBorders>
               <w:top w:val="single" w:color="BFC9D1" w:sz="4"/>
               <w:left w:val="single" w:color="BFC9D1" w:sz="4"/>
@@ -11610,7 +11851,7 @@
         </w:trPr>
         <w:tc>
           <w:tcPr>
-            <w:tcW w:type="dxa" w:w="2400"/>
+            <w:tcW w:type="dxa" w:w="2300"/>
             <w:tcBorders>
               <w:top w:val="single" w:color="BFC9D1" w:sz="4"/>
               <w:left w:val="single" w:color="BFC9D1" w:sz="4"/>
@@ -11655,13 +11896,13 @@
           </w:tcPr>
           <w:p>
             <w:r>
-              <w:t xml:space="preserve">CLARICE</w:t>
-            </w:r>
-          </w:p>
-        </w:tc>
-        <w:tc>
-          <w:tcPr>
-            <w:tcW w:type="dxa" w:w="900"/>
+              <w:t xml:space="preserve">Clarice, Gabriel</w:t>
+            </w:r>
+          </w:p>
+        </w:tc>
+        <w:tc>
+          <w:tcPr>
+            <w:tcW w:type="dxa" w:w="1100"/>
             <w:tcBorders>
               <w:top w:val="single" w:color="BFC9D1" w:sz="4"/>
               <w:left w:val="single" w:color="BFC9D1" w:sz="4"/>
@@ -11684,7 +11925,7 @@
         </w:tc>
         <w:tc>
           <w:tcPr>
-            <w:tcW w:type="dxa" w:w="2100"/>
+            <w:tcW w:type="dxa" w:w="2000"/>
             <w:tcBorders>
               <w:top w:val="single" w:color="BFC9D1" w:sz="4"/>
               <w:left w:val="single" w:color="BFC9D1" w:sz="4"/>
@@ -11724,7 +11965,7 @@
           </w:tcPr>
           <w:p>
             <w:r>
-              <w:t xml:space="preserve">Primeira voz do rádio: a Clarice, com o que o Henrique vê pelas câmeras.</w:t>
+              <w:t xml:space="preserve">Primeira voz do rádio: a Clarice, com o que o Henrique vê pelas câmeras. O Gabriel estranha e ela o chama para o encontrar.</w:t>
             </w:r>
           </w:p>
         </w:tc>
@@ -11735,7 +11976,7 @@
         </w:trPr>
         <w:tc>
           <w:tcPr>
-            <w:tcW w:type="dxa" w:w="2400"/>
+            <w:tcW w:type="dxa" w:w="2300"/>
             <w:tcBorders>
               <w:top w:val="single" w:color="BFC9D1" w:sz="4"/>
               <w:left w:val="single" w:color="BFC9D1" w:sz="4"/>
@@ -11786,7 +12027,7 @@
         </w:tc>
         <w:tc>
           <w:tcPr>
-            <w:tcW w:type="dxa" w:w="900"/>
+            <w:tcW w:type="dxa" w:w="1100"/>
             <w:tcBorders>
               <w:top w:val="single" w:color="BFC9D1" w:sz="4"/>
               <w:left w:val="single" w:color="BFC9D1" w:sz="4"/>
@@ -11809,7 +12050,7 @@
         </w:tc>
         <w:tc>
           <w:tcPr>
-            <w:tcW w:type="dxa" w:w="2100"/>
+            <w:tcW w:type="dxa" w:w="2000"/>
             <w:tcBorders>
               <w:top w:val="single" w:color="BFC9D1" w:sz="4"/>
               <w:left w:val="single" w:color="BFC9D1" w:sz="4"/>
@@ -11860,7 +12101,7 @@
         </w:trPr>
         <w:tc>
           <w:tcPr>
-            <w:tcW w:type="dxa" w:w="2400"/>
+            <w:tcW w:type="dxa" w:w="2300"/>
             <w:tcBorders>
               <w:top w:val="single" w:color="BFC9D1" w:sz="4"/>
               <w:left w:val="single" w:color="BFC9D1" w:sz="4"/>
@@ -11905,13 +12146,13 @@
           </w:tcPr>
           <w:p>
             <w:r>
-              <w:t xml:space="preserve">ZANE</w:t>
-            </w:r>
-          </w:p>
-        </w:tc>
-        <w:tc>
-          <w:tcPr>
-            <w:tcW w:type="dxa" w:w="900"/>
+              <w:t xml:space="preserve">Zane, Gabriel</w:t>
+            </w:r>
+          </w:p>
+        </w:tc>
+        <w:tc>
+          <w:tcPr>
+            <w:tcW w:type="dxa" w:w="1100"/>
             <w:tcBorders>
               <w:top w:val="single" w:color="BFC9D1" w:sz="4"/>
               <w:left w:val="single" w:color="BFC9D1" w:sz="4"/>
@@ -11934,7 +12175,7 @@
         </w:tc>
         <w:tc>
           <w:tcPr>
-            <w:tcW w:type="dxa" w:w="2100"/>
+            <w:tcW w:type="dxa" w:w="2000"/>
             <w:tcBorders>
               <w:top w:val="single" w:color="BFC9D1" w:sz="4"/>
               <w:left w:val="single" w:color="BFC9D1" w:sz="4"/>
@@ -11974,7 +12215,7 @@
           </w:tcPr>
           <w:p>
             <w:r>
-              <w:t xml:space="preserve">Primeira ligação do Zane: destranca a porta pelo sistema.</w:t>
+              <w:t xml:space="preserve">Primeira ligação do Zane: o Gabriel faz perguntas e ele destranca a porta pelo sistema.</w:t>
             </w:r>
           </w:p>
         </w:tc>
@@ -11985,7 +12226,7 @@
         </w:trPr>
         <w:tc>
           <w:tcPr>
-            <w:tcW w:type="dxa" w:w="2400"/>
+            <w:tcW w:type="dxa" w:w="2300"/>
             <w:tcBorders>
               <w:top w:val="single" w:color="BFC9D1" w:sz="4"/>
               <w:left w:val="single" w:color="BFC9D1" w:sz="4"/>
@@ -12031,7 +12272,7 @@
         </w:tc>
         <w:tc>
           <w:tcPr>
-            <w:tcW w:type="dxa" w:w="900"/>
+            <w:tcW w:type="dxa" w:w="1100"/>
             <w:tcBorders>
               <w:top w:val="single" w:color="BFC9D1" w:sz="4"/>
               <w:left w:val="single" w:color="BFC9D1" w:sz="4"/>
@@ -12054,7 +12295,7 @@
         </w:tc>
         <w:tc>
           <w:tcPr>
-            <w:tcW w:type="dxa" w:w="2100"/>
+            <w:tcW w:type="dxa" w:w="2000"/>
             <w:tcBorders>
               <w:top w:val="single" w:color="BFC9D1" w:sz="4"/>
               <w:left w:val="single" w:color="BFC9D1" w:sz="4"/>
@@ -18232,10 +18473,10 @@
         </w:tblBorders>
       </w:tblPr>
       <w:tblGrid>
-        <w:gridCol w:w="2400"/>
+        <w:gridCol w:w="2300"/>
         <w:gridCol w:w="1200"/>
-        <w:gridCol w:w="900"/>
-        <w:gridCol w:w="2100"/>
+        <w:gridCol w:w="1100"/>
+        <w:gridCol w:w="2000"/>
         <w:gridCol w:w="2426"/>
       </w:tblGrid>
       <w:tr>
@@ -18244,7 +18485,7 @@
         </w:trPr>
         <w:tc>
           <w:tcPr>
-            <w:tcW w:type="dxa" w:w="2400"/>
+            <w:tcW w:type="dxa" w:w="2300"/>
             <w:tcBorders>
               <w:top w:val="single" w:color="BFC9D1" w:sz="4"/>
               <w:left w:val="single" w:color="BFC9D1" w:sz="4"/>
@@ -18302,7 +18543,7 @@
         </w:tc>
         <w:tc>
           <w:tcPr>
-            <w:tcW w:type="dxa" w:w="900"/>
+            <w:tcW w:type="dxa" w:w="1100"/>
             <w:tcBorders>
               <w:top w:val="single" w:color="BFC9D1" w:sz="4"/>
               <w:left w:val="single" w:color="BFC9D1" w:sz="4"/>
@@ -18331,7 +18572,7 @@
         </w:tc>
         <w:tc>
           <w:tcPr>
-            <w:tcW w:type="dxa" w:w="2100"/>
+            <w:tcW w:type="dxa" w:w="2000"/>
             <w:tcBorders>
               <w:top w:val="single" w:color="BFC9D1" w:sz="4"/>
               <w:left w:val="single" w:color="BFC9D1" w:sz="4"/>
@@ -18394,7 +18635,7 @@
         </w:trPr>
         <w:tc>
           <w:tcPr>
-            <w:tcW w:type="dxa" w:w="2400"/>
+            <w:tcW w:type="dxa" w:w="2300"/>
             <w:tcBorders>
               <w:top w:val="single" w:color="BFC9D1" w:sz="4"/>
               <w:left w:val="single" w:color="BFC9D1" w:sz="4"/>
@@ -18445,7 +18686,7 @@
         </w:tc>
         <w:tc>
           <w:tcPr>
-            <w:tcW w:type="dxa" w:w="900"/>
+            <w:tcW w:type="dxa" w:w="1100"/>
             <w:tcBorders>
               <w:top w:val="single" w:color="BFC9D1" w:sz="4"/>
               <w:left w:val="single" w:color="BFC9D1" w:sz="4"/>
@@ -18468,7 +18709,7 @@
         </w:tc>
         <w:tc>
           <w:tcPr>
-            <w:tcW w:type="dxa" w:w="2100"/>
+            <w:tcW w:type="dxa" w:w="2000"/>
             <w:tcBorders>
               <w:top w:val="single" w:color="BFC9D1" w:sz="4"/>
               <w:left w:val="single" w:color="BFC9D1" w:sz="4"/>
@@ -18519,7 +18760,7 @@
         </w:trPr>
         <w:tc>
           <w:tcPr>
-            <w:tcW w:type="dxa" w:w="2400"/>
+            <w:tcW w:type="dxa" w:w="2300"/>
             <w:tcBorders>
               <w:top w:val="single" w:color="BFC9D1" w:sz="4"/>
               <w:left w:val="single" w:color="BFC9D1" w:sz="4"/>
@@ -18570,7 +18811,7 @@
         </w:tc>
         <w:tc>
           <w:tcPr>
-            <w:tcW w:type="dxa" w:w="900"/>
+            <w:tcW w:type="dxa" w:w="1100"/>
             <w:tcBorders>
               <w:top w:val="single" w:color="BFC9D1" w:sz="4"/>
               <w:left w:val="single" w:color="BFC9D1" w:sz="4"/>
@@ -18593,7 +18834,7 @@
         </w:tc>
         <w:tc>
           <w:tcPr>
-            <w:tcW w:type="dxa" w:w="2100"/>
+            <w:tcW w:type="dxa" w:w="2000"/>
             <w:tcBorders>
               <w:top w:val="single" w:color="BFC9D1" w:sz="4"/>
               <w:left w:val="single" w:color="BFC9D1" w:sz="4"/>
@@ -18644,7 +18885,7 @@
         </w:trPr>
         <w:tc>
           <w:tcPr>
-            <w:tcW w:type="dxa" w:w="2400"/>
+            <w:tcW w:type="dxa" w:w="2300"/>
             <w:tcBorders>
               <w:top w:val="single" w:color="BFC9D1" w:sz="4"/>
               <w:left w:val="single" w:color="BFC9D1" w:sz="4"/>
@@ -18695,7 +18936,7 @@
         </w:tc>
         <w:tc>
           <w:tcPr>
-            <w:tcW w:type="dxa" w:w="900"/>
+            <w:tcW w:type="dxa" w:w="1100"/>
             <w:tcBorders>
               <w:top w:val="single" w:color="BFC9D1" w:sz="4"/>
               <w:left w:val="single" w:color="BFC9D1" w:sz="4"/>
@@ -18718,7 +18959,7 @@
         </w:tc>
         <w:tc>
           <w:tcPr>
-            <w:tcW w:type="dxa" w:w="2100"/>
+            <w:tcW w:type="dxa" w:w="2000"/>
             <w:tcBorders>
               <w:top w:val="single" w:color="BFC9D1" w:sz="4"/>
               <w:left w:val="single" w:color="BFC9D1" w:sz="4"/>
@@ -18769,7 +19010,7 @@
         </w:trPr>
         <w:tc>
           <w:tcPr>
-            <w:tcW w:type="dxa" w:w="2400"/>
+            <w:tcW w:type="dxa" w:w="2300"/>
             <w:tcBorders>
               <w:top w:val="single" w:color="BFC9D1" w:sz="4"/>
               <w:left w:val="single" w:color="BFC9D1" w:sz="4"/>
@@ -18820,7 +19061,7 @@
         </w:tc>
         <w:tc>
           <w:tcPr>
-            <w:tcW w:type="dxa" w:w="900"/>
+            <w:tcW w:type="dxa" w:w="1100"/>
             <w:tcBorders>
               <w:top w:val="single" w:color="BFC9D1" w:sz="4"/>
               <w:left w:val="single" w:color="BFC9D1" w:sz="4"/>
@@ -18843,7 +19084,7 @@
         </w:tc>
         <w:tc>
           <w:tcPr>
-            <w:tcW w:type="dxa" w:w="2100"/>
+            <w:tcW w:type="dxa" w:w="2000"/>
             <w:tcBorders>
               <w:top w:val="single" w:color="BFC9D1" w:sz="4"/>
               <w:left w:val="single" w:color="BFC9D1" w:sz="4"/>
@@ -18894,7 +19135,7 @@
         </w:trPr>
         <w:tc>
           <w:tcPr>
-            <w:tcW w:type="dxa" w:w="2400"/>
+            <w:tcW w:type="dxa" w:w="2300"/>
             <w:tcBorders>
               <w:top w:val="single" w:color="BFC9D1" w:sz="4"/>
               <w:left w:val="single" w:color="BFC9D1" w:sz="4"/>
@@ -18945,7 +19186,7 @@
         </w:tc>
         <w:tc>
           <w:tcPr>
-            <w:tcW w:type="dxa" w:w="900"/>
+            <w:tcW w:type="dxa" w:w="1100"/>
             <w:tcBorders>
               <w:top w:val="single" w:color="BFC9D1" w:sz="4"/>
               <w:left w:val="single" w:color="BFC9D1" w:sz="4"/>
@@ -18968,7 +19209,7 @@
         </w:tc>
         <w:tc>
           <w:tcPr>
-            <w:tcW w:type="dxa" w:w="2100"/>
+            <w:tcW w:type="dxa" w:w="2000"/>
             <w:tcBorders>
               <w:top w:val="single" w:color="BFC9D1" w:sz="4"/>
               <w:left w:val="single" w:color="BFC9D1" w:sz="4"/>
@@ -19019,7 +19260,7 @@
         </w:trPr>
         <w:tc>
           <w:tcPr>
-            <w:tcW w:type="dxa" w:w="2400"/>
+            <w:tcW w:type="dxa" w:w="2300"/>
             <w:tcBorders>
               <w:top w:val="single" w:color="BFC9D1" w:sz="4"/>
               <w:left w:val="single" w:color="BFC9D1" w:sz="4"/>
@@ -19070,7 +19311,7 @@
         </w:tc>
         <w:tc>
           <w:tcPr>
-            <w:tcW w:type="dxa" w:w="900"/>
+            <w:tcW w:type="dxa" w:w="1100"/>
             <w:tcBorders>
               <w:top w:val="single" w:color="BFC9D1" w:sz="4"/>
               <w:left w:val="single" w:color="BFC9D1" w:sz="4"/>
@@ -19093,7 +19334,7 @@
         </w:tc>
         <w:tc>
           <w:tcPr>
-            <w:tcW w:type="dxa" w:w="2100"/>
+            <w:tcW w:type="dxa" w:w="2000"/>
             <w:tcBorders>
               <w:top w:val="single" w:color="BFC9D1" w:sz="4"/>
               <w:left w:val="single" w:color="BFC9D1" w:sz="4"/>
@@ -19144,7 +19385,7 @@
         </w:trPr>
         <w:tc>
           <w:tcPr>
-            <w:tcW w:type="dxa" w:w="2400"/>
+            <w:tcW w:type="dxa" w:w="2300"/>
             <w:tcBorders>
               <w:top w:val="single" w:color="BFC9D1" w:sz="4"/>
               <w:left w:val="single" w:color="BFC9D1" w:sz="4"/>
@@ -19195,7 +19436,7 @@
         </w:tc>
         <w:tc>
           <w:tcPr>
-            <w:tcW w:type="dxa" w:w="900"/>
+            <w:tcW w:type="dxa" w:w="1100"/>
             <w:tcBorders>
               <w:top w:val="single" w:color="BFC9D1" w:sz="4"/>
               <w:left w:val="single" w:color="BFC9D1" w:sz="4"/>
@@ -19218,7 +19459,7 @@
         </w:tc>
         <w:tc>
           <w:tcPr>
-            <w:tcW w:type="dxa" w:w="2100"/>
+            <w:tcW w:type="dxa" w:w="2000"/>
             <w:tcBorders>
               <w:top w:val="single" w:color="BFC9D1" w:sz="4"/>
               <w:left w:val="single" w:color="BFC9D1" w:sz="4"/>
@@ -19269,7 +19510,7 @@
         </w:trPr>
         <w:tc>
           <w:tcPr>
-            <w:tcW w:type="dxa" w:w="2400"/>
+            <w:tcW w:type="dxa" w:w="2300"/>
             <w:tcBorders>
               <w:top w:val="single" w:color="BFC9D1" w:sz="4"/>
               <w:left w:val="single" w:color="BFC9D1" w:sz="4"/>
@@ -19320,7 +19561,7 @@
         </w:tc>
         <w:tc>
           <w:tcPr>
-            <w:tcW w:type="dxa" w:w="900"/>
+            <w:tcW w:type="dxa" w:w="1100"/>
             <w:tcBorders>
               <w:top w:val="single" w:color="BFC9D1" w:sz="4"/>
               <w:left w:val="single" w:color="BFC9D1" w:sz="4"/>
@@ -19343,7 +19584,7 @@
         </w:tc>
         <w:tc>
           <w:tcPr>
-            <w:tcW w:type="dxa" w:w="2100"/>
+            <w:tcW w:type="dxa" w:w="2000"/>
             <w:tcBorders>
               <w:top w:val="single" w:color="BFC9D1" w:sz="4"/>
               <w:left w:val="single" w:color="BFC9D1" w:sz="4"/>
@@ -19394,7 +19635,7 @@
         </w:trPr>
         <w:tc>
           <w:tcPr>
-            <w:tcW w:type="dxa" w:w="2400"/>
+            <w:tcW w:type="dxa" w:w="2300"/>
             <w:tcBorders>
               <w:top w:val="single" w:color="BFC9D1" w:sz="4"/>
               <w:left w:val="single" w:color="BFC9D1" w:sz="4"/>
@@ -19440,7 +19681,7 @@
         </w:tc>
         <w:tc>
           <w:tcPr>
-            <w:tcW w:type="dxa" w:w="900"/>
+            <w:tcW w:type="dxa" w:w="1100"/>
             <w:tcBorders>
               <w:top w:val="single" w:color="BFC9D1" w:sz="4"/>
               <w:left w:val="single" w:color="BFC9D1" w:sz="4"/>
@@ -19463,7 +19704,7 @@
         </w:tc>
         <w:tc>
           <w:tcPr>
-            <w:tcW w:type="dxa" w:w="2100"/>
+            <w:tcW w:type="dxa" w:w="2000"/>
             <w:tcBorders>
               <w:top w:val="single" w:color="BFC9D1" w:sz="4"/>
               <w:left w:val="single" w:color="BFC9D1" w:sz="4"/>
@@ -23361,10 +23602,10 @@
         </w:tblBorders>
       </w:tblPr>
       <w:tblGrid>
-        <w:gridCol w:w="2400"/>
+        <w:gridCol w:w="2300"/>
         <w:gridCol w:w="1200"/>
-        <w:gridCol w:w="900"/>
-        <w:gridCol w:w="2100"/>
+        <w:gridCol w:w="1100"/>
+        <w:gridCol w:w="2000"/>
         <w:gridCol w:w="2426"/>
       </w:tblGrid>
       <w:tr>
@@ -23373,7 +23614,7 @@
         </w:trPr>
         <w:tc>
           <w:tcPr>
-            <w:tcW w:type="dxa" w:w="2400"/>
+            <w:tcW w:type="dxa" w:w="2300"/>
             <w:tcBorders>
               <w:top w:val="single" w:color="BFC9D1" w:sz="4"/>
               <w:left w:val="single" w:color="BFC9D1" w:sz="4"/>
@@ -23431,7 +23672,7 @@
         </w:tc>
         <w:tc>
           <w:tcPr>
-            <w:tcW w:type="dxa" w:w="900"/>
+            <w:tcW w:type="dxa" w:w="1100"/>
             <w:tcBorders>
               <w:top w:val="single" w:color="BFC9D1" w:sz="4"/>
               <w:left w:val="single" w:color="BFC9D1" w:sz="4"/>
@@ -23460,7 +23701,7 @@
         </w:tc>
         <w:tc>
           <w:tcPr>
-            <w:tcW w:type="dxa" w:w="2100"/>
+            <w:tcW w:type="dxa" w:w="2000"/>
             <w:tcBorders>
               <w:top w:val="single" w:color="BFC9D1" w:sz="4"/>
               <w:left w:val="single" w:color="BFC9D1" w:sz="4"/>
@@ -23523,7 +23764,7 @@
         </w:trPr>
         <w:tc>
           <w:tcPr>
-            <w:tcW w:type="dxa" w:w="2400"/>
+            <w:tcW w:type="dxa" w:w="2300"/>
             <w:tcBorders>
               <w:top w:val="single" w:color="BFC9D1" w:sz="4"/>
               <w:left w:val="single" w:color="BFC9D1" w:sz="4"/>
@@ -23574,7 +23815,7 @@
         </w:tc>
         <w:tc>
           <w:tcPr>
-            <w:tcW w:type="dxa" w:w="900"/>
+            <w:tcW w:type="dxa" w:w="1100"/>
             <w:tcBorders>
               <w:top w:val="single" w:color="BFC9D1" w:sz="4"/>
               <w:left w:val="single" w:color="BFC9D1" w:sz="4"/>
@@ -23597,7 +23838,7 @@
         </w:tc>
         <w:tc>
           <w:tcPr>
-            <w:tcW w:type="dxa" w:w="2100"/>
+            <w:tcW w:type="dxa" w:w="2000"/>
             <w:tcBorders>
               <w:top w:val="single" w:color="BFC9D1" w:sz="4"/>
               <w:left w:val="single" w:color="BFC9D1" w:sz="4"/>
@@ -23648,7 +23889,7 @@
         </w:trPr>
         <w:tc>
           <w:tcPr>
-            <w:tcW w:type="dxa" w:w="2400"/>
+            <w:tcW w:type="dxa" w:w="2300"/>
             <w:tcBorders>
               <w:top w:val="single" w:color="BFC9D1" w:sz="4"/>
               <w:left w:val="single" w:color="BFC9D1" w:sz="4"/>
@@ -23699,7 +23940,7 @@
         </w:tc>
         <w:tc>
           <w:tcPr>
-            <w:tcW w:type="dxa" w:w="900"/>
+            <w:tcW w:type="dxa" w:w="1100"/>
             <w:tcBorders>
               <w:top w:val="single" w:color="BFC9D1" w:sz="4"/>
               <w:left w:val="single" w:color="BFC9D1" w:sz="4"/>
@@ -23722,7 +23963,7 @@
         </w:tc>
         <w:tc>
           <w:tcPr>
-            <w:tcW w:type="dxa" w:w="2100"/>
+            <w:tcW w:type="dxa" w:w="2000"/>
             <w:tcBorders>
               <w:top w:val="single" w:color="BFC9D1" w:sz="4"/>
               <w:left w:val="single" w:color="BFC9D1" w:sz="4"/>
@@ -23773,7 +24014,7 @@
         </w:trPr>
         <w:tc>
           <w:tcPr>
-            <w:tcW w:type="dxa" w:w="2400"/>
+            <w:tcW w:type="dxa" w:w="2300"/>
             <w:tcBorders>
               <w:top w:val="single" w:color="BFC9D1" w:sz="4"/>
               <w:left w:val="single" w:color="BFC9D1" w:sz="4"/>
@@ -23824,7 +24065,7 @@
         </w:tc>
         <w:tc>
           <w:tcPr>
-            <w:tcW w:type="dxa" w:w="900"/>
+            <w:tcW w:type="dxa" w:w="1100"/>
             <w:tcBorders>
               <w:top w:val="single" w:color="BFC9D1" w:sz="4"/>
               <w:left w:val="single" w:color="BFC9D1" w:sz="4"/>
@@ -23847,7 +24088,7 @@
         </w:tc>
         <w:tc>
           <w:tcPr>
-            <w:tcW w:type="dxa" w:w="2100"/>
+            <w:tcW w:type="dxa" w:w="2000"/>
             <w:tcBorders>
               <w:top w:val="single" w:color="BFC9D1" w:sz="4"/>
               <w:left w:val="single" w:color="BFC9D1" w:sz="4"/>
@@ -23898,7 +24139,7 @@
         </w:trPr>
         <w:tc>
           <w:tcPr>
-            <w:tcW w:type="dxa" w:w="2400"/>
+            <w:tcW w:type="dxa" w:w="2300"/>
             <w:tcBorders>
               <w:top w:val="single" w:color="BFC9D1" w:sz="4"/>
               <w:left w:val="single" w:color="BFC9D1" w:sz="4"/>
@@ -23949,7 +24190,7 @@
         </w:tc>
         <w:tc>
           <w:tcPr>
-            <w:tcW w:type="dxa" w:w="900"/>
+            <w:tcW w:type="dxa" w:w="1100"/>
             <w:tcBorders>
               <w:top w:val="single" w:color="BFC9D1" w:sz="4"/>
               <w:left w:val="single" w:color="BFC9D1" w:sz="4"/>
@@ -23972,7 +24213,7 @@
         </w:tc>
         <w:tc>
           <w:tcPr>
-            <w:tcW w:type="dxa" w:w="2100"/>
+            <w:tcW w:type="dxa" w:w="2000"/>
             <w:tcBorders>
               <w:top w:val="single" w:color="BFC9D1" w:sz="4"/>
               <w:left w:val="single" w:color="BFC9D1" w:sz="4"/>
@@ -24023,7 +24264,7 @@
         </w:trPr>
         <w:tc>
           <w:tcPr>
-            <w:tcW w:type="dxa" w:w="2400"/>
+            <w:tcW w:type="dxa" w:w="2300"/>
             <w:tcBorders>
               <w:top w:val="single" w:color="BFC9D1" w:sz="4"/>
               <w:left w:val="single" w:color="BFC9D1" w:sz="4"/>
@@ -24074,7 +24315,7 @@
         </w:tc>
         <w:tc>
           <w:tcPr>
-            <w:tcW w:type="dxa" w:w="900"/>
+            <w:tcW w:type="dxa" w:w="1100"/>
             <w:tcBorders>
               <w:top w:val="single" w:color="BFC9D1" w:sz="4"/>
               <w:left w:val="single" w:color="BFC9D1" w:sz="4"/>
@@ -24097,7 +24338,7 @@
         </w:tc>
         <w:tc>
           <w:tcPr>
-            <w:tcW w:type="dxa" w:w="2100"/>
+            <w:tcW w:type="dxa" w:w="2000"/>
             <w:tcBorders>
               <w:top w:val="single" w:color="BFC9D1" w:sz="4"/>
               <w:left w:val="single" w:color="BFC9D1" w:sz="4"/>
@@ -24148,7 +24389,7 @@
         </w:trPr>
         <w:tc>
           <w:tcPr>
-            <w:tcW w:type="dxa" w:w="2400"/>
+            <w:tcW w:type="dxa" w:w="2300"/>
             <w:tcBorders>
               <w:top w:val="single" w:color="BFC9D1" w:sz="4"/>
               <w:left w:val="single" w:color="BFC9D1" w:sz="4"/>
@@ -24199,7 +24440,7 @@
         </w:tc>
         <w:tc>
           <w:tcPr>
-            <w:tcW w:type="dxa" w:w="900"/>
+            <w:tcW w:type="dxa" w:w="1100"/>
             <w:tcBorders>
               <w:top w:val="single" w:color="BFC9D1" w:sz="4"/>
               <w:left w:val="single" w:color="BFC9D1" w:sz="4"/>
@@ -24222,7 +24463,7 @@
         </w:tc>
         <w:tc>
           <w:tcPr>
-            <w:tcW w:type="dxa" w:w="2100"/>
+            <w:tcW w:type="dxa" w:w="2000"/>
             <w:tcBorders>
               <w:top w:val="single" w:color="BFC9D1" w:sz="4"/>
               <w:left w:val="single" w:color="BFC9D1" w:sz="4"/>
@@ -24273,7 +24514,7 @@
         </w:trPr>
         <w:tc>
           <w:tcPr>
-            <w:tcW w:type="dxa" w:w="2400"/>
+            <w:tcW w:type="dxa" w:w="2300"/>
             <w:tcBorders>
               <w:top w:val="single" w:color="BFC9D1" w:sz="4"/>
               <w:left w:val="single" w:color="BFC9D1" w:sz="4"/>
@@ -24319,7 +24560,7 @@
         </w:tc>
         <w:tc>
           <w:tcPr>
-            <w:tcW w:type="dxa" w:w="900"/>
+            <w:tcW w:type="dxa" w:w="1100"/>
             <w:tcBorders>
               <w:top w:val="single" w:color="BFC9D1" w:sz="4"/>
               <w:left w:val="single" w:color="BFC9D1" w:sz="4"/>
@@ -24342,7 +24583,7 @@
         </w:tc>
         <w:tc>
           <w:tcPr>
-            <w:tcW w:type="dxa" w:w="2100"/>
+            <w:tcW w:type="dxa" w:w="2000"/>
             <w:tcBorders>
               <w:top w:val="single" w:color="BFC9D1" w:sz="4"/>
               <w:left w:val="single" w:color="BFC9D1" w:sz="4"/>
@@ -28270,10 +28511,10 @@
         </w:tblBorders>
       </w:tblPr>
       <w:tblGrid>
-        <w:gridCol w:w="2400"/>
+        <w:gridCol w:w="2300"/>
         <w:gridCol w:w="1200"/>
-        <w:gridCol w:w="900"/>
-        <w:gridCol w:w="2100"/>
+        <w:gridCol w:w="1100"/>
+        <w:gridCol w:w="2000"/>
         <w:gridCol w:w="2426"/>
       </w:tblGrid>
       <w:tr>
@@ -28282,7 +28523,7 @@
         </w:trPr>
         <w:tc>
           <w:tcPr>
-            <w:tcW w:type="dxa" w:w="2400"/>
+            <w:tcW w:type="dxa" w:w="2300"/>
             <w:tcBorders>
               <w:top w:val="single" w:color="BFC9D1" w:sz="4"/>
               <w:left w:val="single" w:color="BFC9D1" w:sz="4"/>
@@ -28340,7 +28581,7 @@
         </w:tc>
         <w:tc>
           <w:tcPr>
-            <w:tcW w:type="dxa" w:w="900"/>
+            <w:tcW w:type="dxa" w:w="1100"/>
             <w:tcBorders>
               <w:top w:val="single" w:color="BFC9D1" w:sz="4"/>
               <w:left w:val="single" w:color="BFC9D1" w:sz="4"/>
@@ -28369,7 +28610,7 @@
         </w:tc>
         <w:tc>
           <w:tcPr>
-            <w:tcW w:type="dxa" w:w="2100"/>
+            <w:tcW w:type="dxa" w:w="2000"/>
             <w:tcBorders>
               <w:top w:val="single" w:color="BFC9D1" w:sz="4"/>
               <w:left w:val="single" w:color="BFC9D1" w:sz="4"/>
@@ -28432,7 +28673,7 @@
         </w:trPr>
         <w:tc>
           <w:tcPr>
-            <w:tcW w:type="dxa" w:w="2400"/>
+            <w:tcW w:type="dxa" w:w="2300"/>
             <w:tcBorders>
               <w:top w:val="single" w:color="BFC9D1" w:sz="4"/>
               <w:left w:val="single" w:color="BFC9D1" w:sz="4"/>
@@ -28483,7 +28724,7 @@
         </w:tc>
         <w:tc>
           <w:tcPr>
-            <w:tcW w:type="dxa" w:w="900"/>
+            <w:tcW w:type="dxa" w:w="1100"/>
             <w:tcBorders>
               <w:top w:val="single" w:color="BFC9D1" w:sz="4"/>
               <w:left w:val="single" w:color="BFC9D1" w:sz="4"/>
@@ -28506,7 +28747,7 @@
         </w:tc>
         <w:tc>
           <w:tcPr>
-            <w:tcW w:type="dxa" w:w="2100"/>
+            <w:tcW w:type="dxa" w:w="2000"/>
             <w:tcBorders>
               <w:top w:val="single" w:color="BFC9D1" w:sz="4"/>
               <w:left w:val="single" w:color="BFC9D1" w:sz="4"/>
@@ -28557,7 +28798,7 @@
         </w:trPr>
         <w:tc>
           <w:tcPr>
-            <w:tcW w:type="dxa" w:w="2400"/>
+            <w:tcW w:type="dxa" w:w="2300"/>
             <w:tcBorders>
               <w:top w:val="single" w:color="BFC9D1" w:sz="4"/>
               <w:left w:val="single" w:color="BFC9D1" w:sz="4"/>
@@ -28608,7 +28849,7 @@
         </w:tc>
         <w:tc>
           <w:tcPr>
-            <w:tcW w:type="dxa" w:w="900"/>
+            <w:tcW w:type="dxa" w:w="1100"/>
             <w:tcBorders>
               <w:top w:val="single" w:color="BFC9D1" w:sz="4"/>
               <w:left w:val="single" w:color="BFC9D1" w:sz="4"/>
@@ -28631,7 +28872,7 @@
         </w:tc>
         <w:tc>
           <w:tcPr>
-            <w:tcW w:type="dxa" w:w="2100"/>
+            <w:tcW w:type="dxa" w:w="2000"/>
             <w:tcBorders>
               <w:top w:val="single" w:color="BFC9D1" w:sz="4"/>
               <w:left w:val="single" w:color="BFC9D1" w:sz="4"/>
@@ -28682,7 +28923,7 @@
         </w:trPr>
         <w:tc>
           <w:tcPr>
-            <w:tcW w:type="dxa" w:w="2400"/>
+            <w:tcW w:type="dxa" w:w="2300"/>
             <w:tcBorders>
               <w:top w:val="single" w:color="BFC9D1" w:sz="4"/>
               <w:left w:val="single" w:color="BFC9D1" w:sz="4"/>
@@ -28728,7 +28969,7 @@
         </w:tc>
         <w:tc>
           <w:tcPr>
-            <w:tcW w:type="dxa" w:w="900"/>
+            <w:tcW w:type="dxa" w:w="1100"/>
             <w:tcBorders>
               <w:top w:val="single" w:color="BFC9D1" w:sz="4"/>
               <w:left w:val="single" w:color="BFC9D1" w:sz="4"/>
@@ -28751,7 +28992,7 @@
         </w:tc>
         <w:tc>
           <w:tcPr>
-            <w:tcW w:type="dxa" w:w="2100"/>
+            <w:tcW w:type="dxa" w:w="2000"/>
             <w:tcBorders>
               <w:top w:val="single" w:color="BFC9D1" w:sz="4"/>
               <w:left w:val="single" w:color="BFC9D1" w:sz="4"/>
@@ -33544,10 +33785,10 @@
         </w:tblBorders>
       </w:tblPr>
       <w:tblGrid>
-        <w:gridCol w:w="2400"/>
+        <w:gridCol w:w="2300"/>
         <w:gridCol w:w="1200"/>
-        <w:gridCol w:w="900"/>
-        <w:gridCol w:w="2100"/>
+        <w:gridCol w:w="1100"/>
+        <w:gridCol w:w="2000"/>
         <w:gridCol w:w="2426"/>
       </w:tblGrid>
       <w:tr>
@@ -33556,7 +33797,7 @@
         </w:trPr>
         <w:tc>
           <w:tcPr>
-            <w:tcW w:type="dxa" w:w="2400"/>
+            <w:tcW w:type="dxa" w:w="2300"/>
             <w:tcBorders>
               <w:top w:val="single" w:color="BFC9D1" w:sz="4"/>
               <w:left w:val="single" w:color="BFC9D1" w:sz="4"/>
@@ -33614,7 +33855,7 @@
         </w:tc>
         <w:tc>
           <w:tcPr>
-            <w:tcW w:type="dxa" w:w="900"/>
+            <w:tcW w:type="dxa" w:w="1100"/>
             <w:tcBorders>
               <w:top w:val="single" w:color="BFC9D1" w:sz="4"/>
               <w:left w:val="single" w:color="BFC9D1" w:sz="4"/>
@@ -33643,7 +33884,7 @@
         </w:tc>
         <w:tc>
           <w:tcPr>
-            <w:tcW w:type="dxa" w:w="2100"/>
+            <w:tcW w:type="dxa" w:w="2000"/>
             <w:tcBorders>
               <w:top w:val="single" w:color="BFC9D1" w:sz="4"/>
               <w:left w:val="single" w:color="BFC9D1" w:sz="4"/>
@@ -33706,7 +33947,7 @@
         </w:trPr>
         <w:tc>
           <w:tcPr>
-            <w:tcW w:type="dxa" w:w="2400"/>
+            <w:tcW w:type="dxa" w:w="2300"/>
             <w:tcBorders>
               <w:top w:val="single" w:color="BFC9D1" w:sz="4"/>
               <w:left w:val="single" w:color="BFC9D1" w:sz="4"/>
@@ -33757,7 +33998,7 @@
         </w:tc>
         <w:tc>
           <w:tcPr>
-            <w:tcW w:type="dxa" w:w="900"/>
+            <w:tcW w:type="dxa" w:w="1100"/>
             <w:tcBorders>
               <w:top w:val="single" w:color="BFC9D1" w:sz="4"/>
               <w:left w:val="single" w:color="BFC9D1" w:sz="4"/>
@@ -33780,7 +34021,7 @@
         </w:tc>
         <w:tc>
           <w:tcPr>
-            <w:tcW w:type="dxa" w:w="2100"/>
+            <w:tcW w:type="dxa" w:w="2000"/>
             <w:tcBorders>
               <w:top w:val="single" w:color="BFC9D1" w:sz="4"/>
               <w:left w:val="single" w:color="BFC9D1" w:sz="4"/>
@@ -33831,7 +34072,7 @@
         </w:trPr>
         <w:tc>
           <w:tcPr>
-            <w:tcW w:type="dxa" w:w="2400"/>
+            <w:tcW w:type="dxa" w:w="2300"/>
             <w:tcBorders>
               <w:top w:val="single" w:color="BFC9D1" w:sz="4"/>
               <w:left w:val="single" w:color="BFC9D1" w:sz="4"/>
@@ -33882,7 +34123,7 @@
         </w:tc>
         <w:tc>
           <w:tcPr>
-            <w:tcW w:type="dxa" w:w="900"/>
+            <w:tcW w:type="dxa" w:w="1100"/>
             <w:tcBorders>
               <w:top w:val="single" w:color="BFC9D1" w:sz="4"/>
               <w:left w:val="single" w:color="BFC9D1" w:sz="4"/>
@@ -33905,7 +34146,7 @@
         </w:tc>
         <w:tc>
           <w:tcPr>
-            <w:tcW w:type="dxa" w:w="2100"/>
+            <w:tcW w:type="dxa" w:w="2000"/>
             <w:tcBorders>
               <w:top w:val="single" w:color="BFC9D1" w:sz="4"/>
               <w:left w:val="single" w:color="BFC9D1" w:sz="4"/>
@@ -33956,7 +34197,7 @@
         </w:trPr>
         <w:tc>
           <w:tcPr>
-            <w:tcW w:type="dxa" w:w="2400"/>
+            <w:tcW w:type="dxa" w:w="2300"/>
             <w:tcBorders>
               <w:top w:val="single" w:color="BFC9D1" w:sz="4"/>
               <w:left w:val="single" w:color="BFC9D1" w:sz="4"/>
@@ -34002,7 +34243,7 @@
         </w:tc>
         <w:tc>
           <w:tcPr>
-            <w:tcW w:type="dxa" w:w="900"/>
+            <w:tcW w:type="dxa" w:w="1100"/>
             <w:tcBorders>
               <w:top w:val="single" w:color="BFC9D1" w:sz="4"/>
               <w:left w:val="single" w:color="BFC9D1" w:sz="4"/>
@@ -34025,7 +34266,7 @@
         </w:tc>
         <w:tc>
           <w:tcPr>
-            <w:tcW w:type="dxa" w:w="2100"/>
+            <w:tcW w:type="dxa" w:w="2000"/>
             <w:tcBorders>
               <w:top w:val="single" w:color="BFC9D1" w:sz="4"/>
               <w:left w:val="single" w:color="BFC9D1" w:sz="4"/>
@@ -35662,10 +35903,10 @@
         </w:tblBorders>
       </w:tblPr>
       <w:tblGrid>
-        <w:gridCol w:w="2400"/>
+        <w:gridCol w:w="2300"/>
         <w:gridCol w:w="1200"/>
-        <w:gridCol w:w="900"/>
-        <w:gridCol w:w="2100"/>
+        <w:gridCol w:w="1100"/>
+        <w:gridCol w:w="2000"/>
         <w:gridCol w:w="2426"/>
       </w:tblGrid>
       <w:tr>
@@ -35674,7 +35915,7 @@
         </w:trPr>
         <w:tc>
           <w:tcPr>
-            <w:tcW w:type="dxa" w:w="2400"/>
+            <w:tcW w:type="dxa" w:w="2300"/>
             <w:tcBorders>
               <w:top w:val="single" w:color="BFC9D1" w:sz="4"/>
               <w:left w:val="single" w:color="BFC9D1" w:sz="4"/>
@@ -35732,7 +35973,7 @@
         </w:tc>
         <w:tc>
           <w:tcPr>
-            <w:tcW w:type="dxa" w:w="900"/>
+            <w:tcW w:type="dxa" w:w="1100"/>
             <w:tcBorders>
               <w:top w:val="single" w:color="BFC9D1" w:sz="4"/>
               <w:left w:val="single" w:color="BFC9D1" w:sz="4"/>
@@ -35761,7 +36002,7 @@
         </w:tc>
         <w:tc>
           <w:tcPr>
-            <w:tcW w:type="dxa" w:w="2100"/>
+            <w:tcW w:type="dxa" w:w="2000"/>
             <w:tcBorders>
               <w:top w:val="single" w:color="BFC9D1" w:sz="4"/>
               <w:left w:val="single" w:color="BFC9D1" w:sz="4"/>
@@ -35824,7 +36065,7 @@
         </w:trPr>
         <w:tc>
           <w:tcPr>
-            <w:tcW w:type="dxa" w:w="2400"/>
+            <w:tcW w:type="dxa" w:w="2300"/>
             <w:tcBorders>
               <w:top w:val="single" w:color="BFC9D1" w:sz="4"/>
               <w:left w:val="single" w:color="BFC9D1" w:sz="4"/>
@@ -35870,7 +36111,7 @@
         </w:tc>
         <w:tc>
           <w:tcPr>
-            <w:tcW w:type="dxa" w:w="900"/>
+            <w:tcW w:type="dxa" w:w="1100"/>
             <w:tcBorders>
               <w:top w:val="single" w:color="BFC9D1" w:sz="4"/>
               <w:left w:val="single" w:color="BFC9D1" w:sz="4"/>
@@ -35893,7 +36134,7 @@
         </w:tc>
         <w:tc>
           <w:tcPr>
-            <w:tcW w:type="dxa" w:w="2100"/>
+            <w:tcW w:type="dxa" w:w="2000"/>
             <w:tcBorders>
               <w:top w:val="single" w:color="BFC9D1" w:sz="4"/>
               <w:left w:val="single" w:color="BFC9D1" w:sz="4"/>
@@ -35944,7 +36185,7 @@
         </w:trPr>
         <w:tc>
           <w:tcPr>
-            <w:tcW w:type="dxa" w:w="2400"/>
+            <w:tcW w:type="dxa" w:w="2300"/>
             <w:tcBorders>
               <w:top w:val="single" w:color="BFC9D1" w:sz="4"/>
               <w:left w:val="single" w:color="BFC9D1" w:sz="4"/>
@@ -35990,7 +36231,7 @@
         </w:tc>
         <w:tc>
           <w:tcPr>
-            <w:tcW w:type="dxa" w:w="900"/>
+            <w:tcW w:type="dxa" w:w="1100"/>
             <w:tcBorders>
               <w:top w:val="single" w:color="BFC9D1" w:sz="4"/>
               <w:left w:val="single" w:color="BFC9D1" w:sz="4"/>
@@ -36013,7 +36254,7 @@
         </w:tc>
         <w:tc>
           <w:tcPr>
-            <w:tcW w:type="dxa" w:w="2100"/>
+            <w:tcW w:type="dxa" w:w="2000"/>
             <w:tcBorders>
               <w:top w:val="single" w:color="BFC9D1" w:sz="4"/>
               <w:left w:val="single" w:color="BFC9D1" w:sz="4"/>
@@ -36064,7 +36305,7 @@
         </w:trPr>
         <w:tc>
           <w:tcPr>
-            <w:tcW w:type="dxa" w:w="2400"/>
+            <w:tcW w:type="dxa" w:w="2300"/>
             <w:tcBorders>
               <w:top w:val="single" w:color="BFC9D1" w:sz="4"/>
               <w:left w:val="single" w:color="BFC9D1" w:sz="4"/>
@@ -36110,7 +36351,7 @@
         </w:tc>
         <w:tc>
           <w:tcPr>
-            <w:tcW w:type="dxa" w:w="900"/>
+            <w:tcW w:type="dxa" w:w="1100"/>
             <w:tcBorders>
               <w:top w:val="single" w:color="BFC9D1" w:sz="4"/>
               <w:left w:val="single" w:color="BFC9D1" w:sz="4"/>
@@ -36133,7 +36374,7 @@
         </w:tc>
         <w:tc>
           <w:tcPr>
-            <w:tcW w:type="dxa" w:w="2100"/>
+            <w:tcW w:type="dxa" w:w="2000"/>
             <w:tcBorders>
               <w:top w:val="single" w:color="BFC9D1" w:sz="4"/>
               <w:left w:val="single" w:color="BFC9D1" w:sz="4"/>
@@ -37522,6 +37763,162 @@
         <w:pStyle w:val="Heading2"/>
       </w:pPr>
       <w:r>
+        <w:t xml:space="preserve">Revisão das falas novas (cenas 1.3 e 1.7)</w:t>
+      </w:r>
+    </w:p>
+    <w:p>
+      <w:pPr>
+        <w:spacing w:after="100"/>
+      </w:pPr>
+      <w:r>
+        <w:t xml:space="preserve">Notas sobre o que foi escrito. As sugestões de fala abaixo são só exemplos e não foram aplicadas às cenas.</w:t>
+      </w:r>
+    </w:p>
+    <w:p>
+      <w:pPr>
+        <w:pStyle w:val="ListParagraph"/>
+        <w:numPr>
+          <w:ilvl w:val="0"/>
+          <w:numId w:val="2"/>
+        </w:numPr>
+        <w:spacing w:after="80"/>
+      </w:pPr>
+      <w:r>
+        <w:rPr>
+          <w:b/>
+          <w:bCs/>
+        </w:rPr>
+        <w:t xml:space="preserve">1. O rádio não responde.</w:t>
+      </w:r>
+      <w:r>
+        <w:t xml:space="preserve"> Hoje uma transmissão tem um falante só e toca sem pausar o jogo: o Gabriel anda enquanto ouve. Para ele responder, a cena precisa virar um diálogo com retratos, que pausa o jogo. Caminhos: (a) só a primeira conversa pelo rádio vira diálogo e as outras continuam transmissões; (b) o Gabriel só responde no telefone; (c) criar transmissões com mais de um falante. A ligação do Zane (1.7) combina mais com resposta, porque o jogador para no balcão para atender.</w:t>
+      </w:r>
+    </w:p>
+    <w:p>
+      <w:pPr>
+        <w:pStyle w:val="ListParagraph"/>
+        <w:numPr>
+          <w:ilvl w:val="0"/>
+          <w:numId w:val="2"/>
+        </w:numPr>
+        <w:spacing w:after="80"/>
+      </w:pPr>
+      <w:r>
+        <w:rPr>
+          <w:b/>
+          <w:bCs/>
+        </w:rPr>
+        <w:t xml:space="preserve">2. O tom do Gabriel.</w:t>
+      </w:r>
+      <w:r>
+        <w:t xml:space="preserve"> A ficha dele diz: frases curtas, ironia seca, mais ouvinte que falante. As falas novas são longas e fazem várias perguntas de uma vez. A ideia (descrença, “tenho trabalho da faculdade”) combina com o prólogo, mas falta a ironia. Exemplo: “Peraí. Isso é pegadinha? Eu tenho lista de equação pra entregar, não tô no clima.”</w:t>
+      </w:r>
+    </w:p>
+    <w:p>
+      <w:pPr>
+        <w:pStyle w:val="ListParagraph"/>
+        <w:numPr>
+          <w:ilvl w:val="0"/>
+          <w:numId w:val="2"/>
+        </w:numPr>
+        <w:spacing w:after="80"/>
+      </w:pPr>
+      <w:r>
+        <w:rPr>
+          <w:b/>
+          <w:bCs/>
+        </w:rPr>
+        <w:t xml:space="preserve">3. Quando ele duvida.</w:t>
+      </w:r>
+      <w:r>
+        <w:t xml:space="preserve"> Na 1.3 o Gabriel já passou por um robô no salão e leu o diário do Baltazar. Na 1.7 já religou a energia e leu o bilhete e o disquete da Clarice. Perguntar “esses robôs são de verdade?” ou falar em pegadinha na 1.7 soa tarde. Sugestão: concentrar a descrença na 1.3 e deixar a 1.7 para a curiosidade e a ironia.</w:t>
+      </w:r>
+    </w:p>
+    <w:p>
+      <w:pPr>
+        <w:pStyle w:val="ListParagraph"/>
+        <w:numPr>
+          <w:ilvl w:val="0"/>
+          <w:numId w:val="2"/>
+        </w:numPr>
+        <w:spacing w:after="80"/>
+      </w:pPr>
+      <w:r>
+        <w:rPr>
+          <w:b/>
+          <w:bCs/>
+        </w:rPr>
+        <w:t xml:space="preserve">4. A voz da Clarice e do Zane.</w:t>
+      </w:r>
+      <w:r>
+        <w:t xml:space="preserve"> A Clarice debocha, usa gírias dos anos 90 (“meu filho”), explica como problema de lógica e diz “não confie nas luzes”. O Zane fala rápido, com gírias de futuro, e interrompe. As falas novas dos dois estão neutras. Exemplo para a Clarice: “Eu explico tudo, meu filho, mas não por rádio. Sai daí e vem me achar. E não confia nas luzes.” Para o Zane: ele corta o Gabriel no meio da pergunta.</w:t>
+      </w:r>
+    </w:p>
+    <w:p>
+      <w:pPr>
+        <w:pStyle w:val="ListParagraph"/>
+        <w:numPr>
+          <w:ilvl w:val="0"/>
+          <w:numId w:val="2"/>
+        </w:numPr>
+        <w:spacing w:after="80"/>
+      </w:pPr>
+      <w:r>
+        <w:rPr>
+          <w:b/>
+          <w:bCs/>
+        </w:rPr>
+        <w:t xml:space="preserve">5. “Como assim, seu tempo?”</w:t>
+      </w:r>
+      <w:r>
+        <w:t xml:space="preserve"> O Zane deixa escapar que é de outra época e a resposta ficou como “[continuando]”. Depende de quando o Gabriel descobre que cada um vem de uma época: o bilhete da Clarice já diz “de 1994”, mas ninguém diz 2123, e a anotação do Caderno nesta cena se chama “Zane, 2123”. Decisão do grupo: nesta ligação ele já fica sabendo que o Zane é do futuro?</w:t>
+      </w:r>
+    </w:p>
+    <w:p>
+      <w:pPr>
+        <w:pStyle w:val="ListParagraph"/>
+        <w:numPr>
+          <w:ilvl w:val="0"/>
+          <w:numId w:val="2"/>
+        </w:numPr>
+        <w:spacing w:after="80"/>
+      </w:pPr>
+      <w:r>
+        <w:rPr>
+          <w:b/>
+          <w:bCs/>
+        </w:rPr>
+        <w:t xml:space="preserve">6. Onde achar a Clarice.</w:t>
+      </w:r>
+      <w:r>
+        <w:t xml:space="preserve"> Na 1.3 ela manda o Gabriel encontrá-la, mas não diz onde, e o Zane só diz “a Clarice vai te explicar quando você chegar até ela”. O lugar (Bloco de salas) aparece no bilhete da 1.6. Se é de propósito, tudo bem.</w:t>
+      </w:r>
+    </w:p>
+    <w:p>
+      <w:pPr>
+        <w:pStyle w:val="ListParagraph"/>
+        <w:numPr>
+          <w:ilvl w:val="0"/>
+          <w:numId w:val="2"/>
+        </w:numPr>
+        <w:spacing w:after="80"/>
+      </w:pPr>
+      <w:r>
+        <w:rPr>
+          <w:b/>
+          <w:bCs/>
+        </w:rPr>
+        <w:t xml:space="preserve">7. O que funcionou.</w:t>
+      </w:r>
+      <w:r>
+        <w:t xml:space="preserve"> O Gabriel dizer o nome na ligação resolve de graça como o Zane sabe o nome dele no rádio do Centro de Convivência. E o “não foi só você” da Clarice combina com ela ter chegado antes.</w:t>
+      </w:r>
+    </w:p>
+    <w:p>
+      <w:pPr>
+        <w:pStyle w:val="Heading2"/>
+      </w:pPr>
+      <w:r>
         <w:t xml:space="preserve">Diálogos que existem nos arquivos, mas não tocam no jogo</w:t>
       </w:r>
     </w:p>
@@ -38777,6 +39174,103 @@
       </w:tr>
       <w:tr>
         <w:trPr>
+          <w:trHeight w:val="480" w:hRule="atLeast"/>
+        </w:trPr>
+        <w:tc>
+          <w:tcPr>
+            <w:tcW w:type="dxa" w:w="1100"/>
+            <w:tcBorders>
+              <w:top w:val="single" w:color="BFC9D1" w:sz="4"/>
+              <w:left w:val="single" w:color="BFC9D1" w:sz="4"/>
+              <w:bottom w:val="single" w:color="BFC9D1" w:sz="4"/>
+              <w:right w:val="single" w:color="BFC9D1" w:sz="4"/>
+            </w:tcBorders>
+            <w:tcMar>
+              <w:top w:type="dxa" w:w="70"/>
+              <w:left w:type="dxa" w:w="110"/>
+              <w:bottom w:type="dxa" w:w="70"/>
+              <w:right w:type="dxa" w:w="110"/>
+            </w:tcMar>
+            <w:vAlign w:val="top"/>
+          </w:tcPr>
+          <w:p>
+            <w:r>
+              <w:t xml:space="preserve">0.3</w:t>
+            </w:r>
+          </w:p>
+        </w:tc>
+        <w:tc>
+          <w:tcPr>
+            <w:tcW w:type="dxa" w:w="1400"/>
+            <w:tcBorders>
+              <w:top w:val="single" w:color="BFC9D1" w:sz="4"/>
+              <w:left w:val="single" w:color="BFC9D1" w:sz="4"/>
+              <w:bottom w:val="single" w:color="BFC9D1" w:sz="4"/>
+              <w:right w:val="single" w:color="BFC9D1" w:sz="4"/>
+            </w:tcBorders>
+            <w:tcMar>
+              <w:top w:type="dxa" w:w="70"/>
+              <w:left w:type="dxa" w:w="110"/>
+              <w:bottom w:type="dxa" w:w="70"/>
+              <w:right w:type="dxa" w:w="110"/>
+            </w:tcMar>
+            <w:vAlign w:val="top"/>
+          </w:tcPr>
+          <w:p>
+            <w:r>
+              <w:t xml:space="preserve">18/10/2026</w:t>
+            </w:r>
+          </w:p>
+        </w:tc>
+        <w:tc>
+          <w:tcPr>
+            <w:tcW w:type="dxa" w:w="2000"/>
+            <w:tcBorders>
+              <w:top w:val="single" w:color="BFC9D1" w:sz="4"/>
+              <w:left w:val="single" w:color="BFC9D1" w:sz="4"/>
+              <w:bottom w:val="single" w:color="BFC9D1" w:sz="4"/>
+              <w:right w:val="single" w:color="BFC9D1" w:sz="4"/>
+            </w:tcBorders>
+            <w:tcMar>
+              <w:top w:type="dxa" w:w="70"/>
+              <w:left w:type="dxa" w:w="110"/>
+              <w:bottom w:type="dxa" w:w="70"/>
+              <w:right w:type="dxa" w:w="110"/>
+            </w:tcMar>
+            <w:vAlign w:val="top"/>
+          </w:tcPr>
+          <w:p>
+            <w:r>
+              <w:t xml:space="preserve"/>
+            </w:r>
+          </w:p>
+        </w:tc>
+        <w:tc>
+          <w:tcPr>
+            <w:tcW w:type="dxa" w:w="4526"/>
+            <w:tcBorders>
+              <w:top w:val="single" w:color="BFC9D1" w:sz="4"/>
+              <w:left w:val="single" w:color="BFC9D1" w:sz="4"/>
+              <w:bottom w:val="single" w:color="BFC9D1" w:sz="4"/>
+              <w:right w:val="single" w:color="BFC9D1" w:sz="4"/>
+            </w:tcBorders>
+            <w:tcMar>
+              <w:top w:type="dxa" w:w="70"/>
+              <w:left w:type="dxa" w:w="110"/>
+              <w:bottom w:type="dxa" w:w="70"/>
+              <w:right w:type="dxa" w:w="110"/>
+            </w:tcMar>
+            <w:vAlign w:val="top"/>
+          </w:tcPr>
+          <w:p>
+            <w:r>
+              <w:t xml:space="preserve">Falas novas das cenas 1.3 e 1.7 estruturadas e revisadas; revisão no Anexo B.</w:t>
+            </w:r>
+          </w:p>
+        </w:tc>
+      </w:tr>
+      <w:tr>
+        <w:trPr>
           <w:trHeight w:val="560" w:hRule="atLeast"/>
         </w:trPr>
         <w:tc>
@@ -39033,7 +39527,7 @@
         <w:sz w:val="17"/>
         <w:szCs w:val="17"/>
       </w:rPr>
-      <w:t xml:space="preserve">Versão 0.2 — Rascunho</w:t>
+      <w:t xml:space="preserve">Versão 0.3 — Rascunho</w:t>
     </w:r>
     <w:r>
       <w:rPr>
@@ -39615,6 +40109,45 @@
       <w:color w:val="7A8794"/>
       <w:sz w:val="17"/>
       <w:szCs w:val="17"/>
+    </w:rPr>
+  </w:style>
+  <w:style w:type="paragraph" w:styleId="PersonagemNovo">
+    <w:name w:val="Personagem novo"/>
+    <w:basedOn w:val="Normal"/>
+    <w:next w:val="Normal"/>
+    <w:qFormat/>
+    <w:pPr>
+      <w:keepNext/>
+      <w:pBdr>
+        <w:left w:val="single" w:color="2A7F8E" w:sz="18" w:space="10"/>
+      </w:pBdr>
+      <w:spacing w:after="0" w:before="120"/>
+      <w:ind w:left="1440" w:right="1440"/>
+      <w:jc w:val="center"/>
+    </w:pPr>
+    <w:rPr>
+      <w:rFonts w:ascii="Courier New" w:cs="Courier New" w:eastAsia="Courier New" w:hAnsi="Courier New"/>
+      <w:caps/>
+      <w:sz w:val="22"/>
+      <w:szCs w:val="22"/>
+    </w:rPr>
+  </w:style>
+  <w:style w:type="paragraph" w:styleId="DialogoNovo">
+    <w:name w:val="Dialogo novo"/>
+    <w:basedOn w:val="Normal"/>
+    <w:next w:val="Normal"/>
+    <w:qFormat/>
+    <w:pPr>
+      <w:pBdr>
+        <w:left w:val="single" w:color="2A7F8E" w:sz="18" w:space="10"/>
+      </w:pBdr>
+      <w:spacing w:after="160"/>
+      <w:ind w:left="1440" w:right="1440"/>
+    </w:pPr>
+    <w:rPr>
+      <w:rFonts w:ascii="Courier New" w:cs="Courier New" w:eastAsia="Courier New" w:hAnsi="Courier New"/>
+      <w:sz w:val="22"/>
+      <w:szCs w:val="22"/>
     </w:rPr>
   </w:style>
   <w:style w:type="paragraph" w:styleId="Cena">

</xml_diff>

<commit_message>
docs: aplica no Roteiro as decisões sobre as cenas 1.3 e 1.7
Co-Authored-By: Claude Sonnet 5.5 <noreply@anthropic.com>
</commit_message>
<xml_diff>
--- a/docs/historia/roteiro/Roteiro.docx
+++ b/docs/historia/roteiro/Roteiro.docx
@@ -126,7 +126,7 @@
           </w:tcPr>
           <w:p>
             <w:r>
-              <w:t xml:space="preserve">0.3 — Rascunho</w:t>
+              <w:t xml:space="preserve">0.4 — Rascunho</w:t>
             </w:r>
           </w:p>
         </w:tc>
@@ -9897,7 +9897,7 @@
         <w:pStyle w:val="DialogoNovo"/>
       </w:pPr>
       <w:r>
-        <w:t xml:space="preserve">Ah, entendo. Olha, eu vou explicar tudo, mas preciso que você saia daí e venha me encontrar. Sei que parece loucura, mas não foi só você. Enfim, qualquer coisa me avisa por aqui. Até logo.</w:t>
+        <w:t xml:space="preserve">Ah, entendo. Pegadinha com robô de verdade custaria uma fortuna, meu filho. Olha, eu vou explicar tudo, mas preciso que você saia daí e venha me encontrar no Bloco de salas. Sei que parece loucura, mas não foi só você. Enfim, qualquer coisa me avisa por aqui. E não confia nas luzes. Até logo.</w:t>
       </w:r>
     </w:p>
     <w:p>
@@ -9998,7 +9998,7 @@
         <w:spacing w:after="60" w:before="60"/>
       </w:pPr>
       <w:r>
-        <w:t xml:space="preserve">Nota: Só a escrita foi corrigida: Clarisse virou Clarice, e ajustei “peraí”, “casa”, “tô”, “daí” e a pontuação. O sentido ficou como você escreveu.</w:t>
+        <w:t xml:space="preserve">Nota: Decidido: o rádio aceita respostas do Gabriel, como o telefone. Falta levar isso para o jogo (Anexo B, item 1).</w:t>
       </w:r>
     </w:p>
     <w:p>
@@ -10007,16 +10007,7 @@
         <w:spacing w:after="60" w:before="60"/>
       </w:pPr>
       <w:r>
-        <w:t xml:space="preserve">Nota: Sumiu do seu texto a última fala da Clarice que já toca no jogo: “Eu fico na escuta. Qualquer coisa, chama. E não confia nas luzes.” Foi de propósito?</w:t>
-      </w:r>
-    </w:p>
-    <w:p>
-      <w:pPr>
-        <w:pStyle w:val="NotaTime"/>
-        <w:spacing w:after="60" w:before="60"/>
-      </w:pPr>
-      <w:r>
-        <w:t xml:space="preserve">Nota: No jogo, o rádio não tem resposta do Gabriel e não pausa. Ver o Anexo B, item 1.</w:t>
+        <w:t xml:space="preserve">Nota: Acrescentei na fala da Clarice: “Pegadinha com robô de verdade custaria uma fortuna, meu filho.”, “no Bloco de salas” e “E não confia nas luzes.”</w:t>
       </w:r>
     </w:p>
     <w:p>
@@ -11141,7 +11132,7 @@
         <w:pStyle w:val="DialogoNovo"/>
       </w:pPr>
       <w:r>
-        <w:t xml:space="preserve">Alô, meu nome é Gabriel. Olha, você pode me explicar o que é tudo isso? Esses robôs são de verdade? Que lugar é esse? Como isso aconteceu?</w:t>
+        <w:t xml:space="preserve">Alô, meu nome é Gabriel. Olha, você pode me explicar o que é tudo isso? Que lugar é esse? Como isso acon—</w:t>
       </w:r>
     </w:p>
     <w:p>
@@ -11157,7 +11148,7 @@
         <w:pStyle w:val="DialogoNovo"/>
       </w:pPr>
       <w:r>
-        <w:t xml:space="preserve">Eu sei que parece brincadeira, mas infelizmente não. A Clarice vai te explicar quando você chegar até ela.</w:t>
+        <w:t xml:space="preserve">Calma, calma! É pergunta demais pra uma linha só. Infelizmente não dá pra explicar tudo por aqui: a Clarice te explica quando você chegar até ela.</w:t>
       </w:r>
     </w:p>
     <w:p>
@@ -11237,7 +11228,7 @@
         <w:pStyle w:val="DialogoNovo"/>
       </w:pPr>
       <w:r>
-        <w:t xml:space="preserve">[continuando]</w:t>
+        <w:t xml:space="preserve">Ih, escapou. Isso é papo longo e a linha tá ruim: depois você junta as peças.</w:t>
       </w:r>
     </w:p>
     <w:p>
@@ -11277,7 +11268,7 @@
         <w:pStyle w:val="DialogoNovo"/>
       </w:pPr>
       <w:r>
-        <w:t xml:space="preserve">Espera! Ah, tinha que ser. Bem que poderia ser uma pegadinha, mas essa tá bem feita.</w:t>
+        <w:t xml:space="preserve">Espera! Ah, tinha que ser. Desligou. Todo mundo aqui explica pela metade.</w:t>
       </w:r>
     </w:p>
     <w:p>
@@ -11350,7 +11341,7 @@
         <w:spacing w:after="60" w:before="60"/>
       </w:pPr>
       <w:r>
-        <w:t xml:space="preserve">Nota: Só a escrita foi corrigida: Clarisse virou Clarice, e ajustei “alô”, “Gabriel”, “restam” e a pontuação. O sentido ficou como você escreveu.</w:t>
+        <w:t xml:space="preserve">Nota: Para concentrar a descrença na 1.3, tirei “Esses robôs são de verdade?”, troquei o “parece brincadeira” do Zane e a “pegadinha” do fim por curiosidade e ironia.</w:t>
       </w:r>
     </w:p>
     <w:p>
@@ -11359,7 +11350,7 @@
         <w:spacing w:after="60" w:before="60"/>
       </w:pPr>
       <w:r>
-        <w:t xml:space="preserve">Nota: Sumiu do seu texto a fala do Zane: “Não desliga. O sistema acusou a grade da ala leste subindo. Foi você, né?”. Foi de propósito?</w:t>
+        <w:t xml:space="preserve">Nota: Acrescentei na voz do Zane: ele corta a pergunta do Gabriel (“Calma, calma!”) e escapa no “seu tempo” (“Ih, escapou…”). Fica como indício, sem resposta (Anexo B, item 5).</w:t>
       </w:r>
     </w:p>
     <w:p>
@@ -11368,7 +11359,7 @@
         <w:spacing w:after="60" w:before="60"/>
       </w:pPr>
       <w:r>
-        <w:t xml:space="preserve">Nota: “[continuando]” é uma fala do Zane que você deixou para escrever depois. Ver o Anexo B, item 5.</w:t>
+        <w:t xml:space="preserve">Nota: Ainda em aberto: a fala do Zane “Não desliga. O sistema acusou a grade da ala leste subindo. Foi você, né?” continua fora do seu texto. Foi de propósito?</w:t>
       </w:r>
     </w:p>
     <w:p>
@@ -37771,7 +37762,7 @@
         <w:spacing w:after="100"/>
       </w:pPr>
       <w:r>
-        <w:t xml:space="preserve">Notas sobre o que foi escrito. As sugestões de fala abaixo são só exemplos e não foram aplicadas às cenas.</w:t>
+        <w:t xml:space="preserve">Cada item diz se foi decidido ou aplicado nas cenas.</w:t>
       </w:r>
     </w:p>
     <w:p>
@@ -37788,10 +37779,10 @@
           <w:b/>
           <w:bCs/>
         </w:rPr>
-        <w:t xml:space="preserve">1. O rádio não responde.</w:t>
-      </w:r>
-      <w:r>
-        <w:t xml:space="preserve"> Hoje uma transmissão tem um falante só e toca sem pausar o jogo: o Gabriel anda enquanto ouve. Para ele responder, a cena precisa virar um diálogo com retratos, que pausa o jogo. Caminhos: (a) só a primeira conversa pelo rádio vira diálogo e as outras continuam transmissões; (b) o Gabriel só responde no telefone; (c) criar transmissões com mais de um falante. A ligação do Zane (1.7) combina mais com resposta, porque o jogador para no balcão para atender.</w:t>
+        <w:t xml:space="preserve">1. O rádio e o telefone aceitam resposta. Decidido em 18/10.</w:t>
+      </w:r>
+      <w:r>
+        <w:t xml:space="preserve"> Hoje uma transmissão tem um falante só e toca sem pausar o jogo, então o Gabriel ainda não responde. Falta escolher como isso funciona no jogo: um diálogo com retratos, que pausa, ou uma transmissão com mais de um falante. Como é uma decisão de mecânica, vale registrar em docs/decisoes.md.</w:t>
       </w:r>
     </w:p>
     <w:p>
@@ -37808,10 +37799,10 @@
           <w:b/>
           <w:bCs/>
         </w:rPr>
-        <w:t xml:space="preserve">2. O tom do Gabriel.</w:t>
-      </w:r>
-      <w:r>
-        <w:t xml:space="preserve"> A ficha dele diz: frases curtas, ironia seca, mais ouvinte que falante. As falas novas são longas e fazem várias perguntas de uma vez. A ideia (descrença, “tenho trabalho da faculdade”) combina com o prólogo, mas falta a ironia. Exemplo: “Peraí. Isso é pegadinha? Eu tenho lista de equação pra entregar, não tô no clima.”</w:t>
+        <w:t xml:space="preserve">2. O tom do Gabriel. Lembrete para cada cena nova.</w:t>
+      </w:r>
+      <w:r>
+        <w:t xml:space="preserve"> A ficha dele diz: frases curtas, ironia seca, mais ouvinte que falante. As falas novas desta versão são longas e fazem várias perguntas de uma vez. A ideia combina com o prólogo, mas falta a ironia. Exemplo: “Peraí. Isso é pegadinha? Eu tenho lista de equação pra entregar, não tô no clima.”</w:t>
       </w:r>
     </w:p>
     <w:p>
@@ -37828,10 +37819,10 @@
           <w:b/>
           <w:bCs/>
         </w:rPr>
-        <w:t xml:space="preserve">3. Quando ele duvida.</w:t>
-      </w:r>
-      <w:r>
-        <w:t xml:space="preserve"> Na 1.3 o Gabriel já passou por um robô no salão e leu o diário do Baltazar. Na 1.7 já religou a energia e leu o bilhete e o disquete da Clarice. Perguntar “esses robôs são de verdade?” ou falar em pegadinha na 1.7 soa tarde. Sugestão: concentrar a descrença na 1.3 e deixar a 1.7 para a curiosidade e a ironia.</w:t>
+        <w:t xml:space="preserve">3. Quando ele duvida. Aplicado.</w:t>
+      </w:r>
+      <w:r>
+        <w:t xml:space="preserve"> A descrença ficou na 1.3, a primeira conversa pelo rádio. Na 1.7 o Gabriel já se escondeu de robôs, religou a energia e leu o bilhete e o disquete, então ali ele fica com a curiosidade e a ironia.</w:t>
       </w:r>
     </w:p>
     <w:p>
@@ -37848,10 +37839,10 @@
           <w:b/>
           <w:bCs/>
         </w:rPr>
-        <w:t xml:space="preserve">4. A voz da Clarice e do Zane.</w:t>
-      </w:r>
-      <w:r>
-        <w:t xml:space="preserve"> A Clarice debocha, usa gírias dos anos 90 (“meu filho”), explica como problema de lógica e diz “não confie nas luzes”. O Zane fala rápido, com gírias de futuro, e interrompe. As falas novas dos dois estão neutras. Exemplo para a Clarice: “Eu explico tudo, meu filho, mas não por rádio. Sai daí e vem me achar. E não confia nas luzes.” Para o Zane: ele corta o Gabriel no meio da pergunta.</w:t>
+        <w:t xml:space="preserve">4. A voz da Clarice e do Zane. Aplicado, em pequeno.</w:t>
+      </w:r>
+      <w:r>
+        <w:t xml:space="preserve"> Clarice: um deboche (“Pegadinha com robô de verdade custaria uma fortuna, meu filho.”) e o “E não confia nas luzes.” de volta. Zane: ele corta a pergunta do Gabriel e escapa no assunto do tempo dele. A ficha do Zane fala em gírias de um futuro que ninguém reconhece, mas ainda não há exemplos delas. Vale o grupo inventar algumas.</w:t>
       </w:r>
     </w:p>
     <w:p>
@@ -37868,10 +37859,10 @@
           <w:b/>
           <w:bCs/>
         </w:rPr>
-        <w:t xml:space="preserve">5. “Como assim, seu tempo?”</w:t>
-      </w:r>
-      <w:r>
-        <w:t xml:space="preserve"> O Zane deixa escapar que é de outra época e a resposta ficou como “[continuando]”. Depende de quando o Gabriel descobre que cada um vem de uma época: o bilhete da Clarice já diz “de 1994”, mas ninguém diz 2123, e a anotação do Caderno nesta cena se chama “Zane, 2123”. Decisão do grupo: nesta ligação ele já fica sabendo que o Zane é do futuro?</w:t>
+        <w:t xml:space="preserve">5. “Como assim, seu tempo?” Decidido: indício, sem resposta.</w:t>
+      </w:r>
+      <w:r>
+        <w:t xml:space="preserve"> O Zane deixa escapar e muda de assunto, e o Gabriel fica na dúvida. Um cuidado: a anotação do Caderno desta cena se chama “Zane, 2123” e entrega a resposta. Para manter a dúvida, o título pode virar só “Zane”. Isso é no arquivo dados/transmissoes/zane_01.tres.</w:t>
       </w:r>
     </w:p>
     <w:p>
@@ -37888,10 +37879,10 @@
           <w:b/>
           <w:bCs/>
         </w:rPr>
-        <w:t xml:space="preserve">6. Onde achar a Clarice.</w:t>
-      </w:r>
-      <w:r>
-        <w:t xml:space="preserve"> Na 1.3 ela manda o Gabriel encontrá-la, mas não diz onde, e o Zane só diz “a Clarice vai te explicar quando você chegar até ela”. O lugar (Bloco de salas) aparece no bilhete da 1.6. Se é de propósito, tudo bem.</w:t>
+        <w:t xml:space="preserve">6. Onde achar a Clarice. Aplicado.</w:t>
+      </w:r>
+      <w:r>
+        <w:t xml:space="preserve"> Na 1.3 a Clarice agora diz que é no Bloco de salas. O Zane continua dizendo só que a Clarice explica.</w:t>
       </w:r>
     </w:p>
     <w:p>
@@ -39271,6 +39262,103 @@
       </w:tr>
       <w:tr>
         <w:trPr>
+          <w:trHeight w:val="480" w:hRule="atLeast"/>
+        </w:trPr>
+        <w:tc>
+          <w:tcPr>
+            <w:tcW w:type="dxa" w:w="1100"/>
+            <w:tcBorders>
+              <w:top w:val="single" w:color="BFC9D1" w:sz="4"/>
+              <w:left w:val="single" w:color="BFC9D1" w:sz="4"/>
+              <w:bottom w:val="single" w:color="BFC9D1" w:sz="4"/>
+              <w:right w:val="single" w:color="BFC9D1" w:sz="4"/>
+            </w:tcBorders>
+            <w:tcMar>
+              <w:top w:type="dxa" w:w="70"/>
+              <w:left w:type="dxa" w:w="110"/>
+              <w:bottom w:type="dxa" w:w="70"/>
+              <w:right w:type="dxa" w:w="110"/>
+            </w:tcMar>
+            <w:vAlign w:val="top"/>
+          </w:tcPr>
+          <w:p>
+            <w:r>
+              <w:t xml:space="preserve">0.4</w:t>
+            </w:r>
+          </w:p>
+        </w:tc>
+        <w:tc>
+          <w:tcPr>
+            <w:tcW w:type="dxa" w:w="1400"/>
+            <w:tcBorders>
+              <w:top w:val="single" w:color="BFC9D1" w:sz="4"/>
+              <w:left w:val="single" w:color="BFC9D1" w:sz="4"/>
+              <w:bottom w:val="single" w:color="BFC9D1" w:sz="4"/>
+              <w:right w:val="single" w:color="BFC9D1" w:sz="4"/>
+            </w:tcBorders>
+            <w:tcMar>
+              <w:top w:type="dxa" w:w="70"/>
+              <w:left w:type="dxa" w:w="110"/>
+              <w:bottom w:type="dxa" w:w="70"/>
+              <w:right w:type="dxa" w:w="110"/>
+            </w:tcMar>
+            <w:vAlign w:val="top"/>
+          </w:tcPr>
+          <w:p>
+            <w:r>
+              <w:t xml:space="preserve">18/10/2026</w:t>
+            </w:r>
+          </w:p>
+        </w:tc>
+        <w:tc>
+          <w:tcPr>
+            <w:tcW w:type="dxa" w:w="2000"/>
+            <w:tcBorders>
+              <w:top w:val="single" w:color="BFC9D1" w:sz="4"/>
+              <w:left w:val="single" w:color="BFC9D1" w:sz="4"/>
+              <w:bottom w:val="single" w:color="BFC9D1" w:sz="4"/>
+              <w:right w:val="single" w:color="BFC9D1" w:sz="4"/>
+            </w:tcBorders>
+            <w:tcMar>
+              <w:top w:type="dxa" w:w="70"/>
+              <w:left w:type="dxa" w:w="110"/>
+              <w:bottom w:type="dxa" w:w="70"/>
+              <w:right w:type="dxa" w:w="110"/>
+            </w:tcMar>
+            <w:vAlign w:val="top"/>
+          </w:tcPr>
+          <w:p>
+            <w:r>
+              <w:t xml:space="preserve"/>
+            </w:r>
+          </w:p>
+        </w:tc>
+        <w:tc>
+          <w:tcPr>
+            <w:tcW w:type="dxa" w:w="4526"/>
+            <w:tcBorders>
+              <w:top w:val="single" w:color="BFC9D1" w:sz="4"/>
+              <w:left w:val="single" w:color="BFC9D1" w:sz="4"/>
+              <w:bottom w:val="single" w:color="BFC9D1" w:sz="4"/>
+              <w:right w:val="single" w:color="BFC9D1" w:sz="4"/>
+            </w:tcBorders>
+            <w:tcMar>
+              <w:top w:type="dxa" w:w="70"/>
+              <w:left w:type="dxa" w:w="110"/>
+              <w:bottom w:type="dxa" w:w="70"/>
+              <w:right w:type="dxa" w:w="110"/>
+            </w:tcMar>
+            <w:vAlign w:val="top"/>
+          </w:tcPr>
+          <w:p>
+            <w:r>
+              <w:t xml:space="preserve">Decisões aplicadas nas cenas 1.3 e 1.7: rádio com resposta, descrença só na 1.3, voz da Clarice e do Zane, Bloco de salas.</w:t>
+            </w:r>
+          </w:p>
+        </w:tc>
+      </w:tr>
+      <w:tr>
+        <w:trPr>
           <w:trHeight w:val="560" w:hRule="atLeast"/>
         </w:trPr>
         <w:tc>
@@ -39527,7 +39615,7 @@
         <w:sz w:val="17"/>
         <w:szCs w:val="17"/>
       </w:rPr>
-      <w:t xml:space="preserve">Versão 0.3 — Rascunho</w:t>
+      <w:t xml:space="preserve">Versão 0.4 — Rascunho</w:t>
     </w:r>
     <w:r>
       <w:rPr>

</xml_diff>

<commit_message>
docs: estrutura e revisa as falas novas do Ato 2 no Roteiro
Co-Authored-By: Claude Sonnet 5.5 <noreply@anthropic.com>
</commit_message>
<xml_diff>
--- a/docs/historia/roteiro/Roteiro.docx
+++ b/docs/historia/roteiro/Roteiro.docx
@@ -126,7 +126,7 @@
           </w:tcPr>
           <w:p>
             <w:r>
-              <w:t xml:space="preserve">0.4 — Rascunho</w:t>
+              <w:t xml:space="preserve">0.6 — Rascunho</w:t>
             </w:r>
           </w:p>
         </w:tc>
@@ -3460,7 +3460,7 @@
           </w:tcPr>
           <w:p>
             <w:r>
-              <w:t xml:space="preserve">1994</w:t>
+              <w:t xml:space="preserve">1990</w:t>
             </w:r>
           </w:p>
         </w:tc>
@@ -9933,7 +9933,7 @@
           <w:b/>
           <w:bCs/>
         </w:rPr>
-        <w:t xml:space="preserve">Clarice, 1994.</w:t>
+        <w:t xml:space="preserve">Clarice, 1990.</w:t>
       </w:r>
       <w:r>
         <w:rPr>
@@ -10294,7 +10294,7 @@
           <w:b/>
           <w:bCs/>
         </w:rPr>
-        <w:t xml:space="preserve">Clarice, 1994.</w:t>
+        <w:t xml:space="preserve">Clarice, 1990.</w:t>
       </w:r>
       <w:r>
         <w:rPr>
@@ -13006,7 +13006,7 @@
                 <w:sz w:val="16"/>
                 <w:szCs w:val="16"/>
               </w:rPr>
-              <w:t xml:space="preserve">Clarice, 1994 · papel: caderno_clarice</w:t>
+              <w:t xml:space="preserve">Clarice, 1990 · papel: caderno_clarice</w:t>
             </w:r>
           </w:p>
         </w:tc>
@@ -13029,7 +13029,7 @@
           </w:tcPr>
           <w:p>
             <w:r>
-              <w:t xml:space="preserve">1994</w:t>
+              <w:t xml:space="preserve">1990</w:t>
             </w:r>
           </w:p>
         </w:tc>
@@ -13079,7 +13079,7 @@
                 <w:sz w:val="17"/>
                 <w:szCs w:val="17"/>
               </w:rPr>
-              <w:t xml:space="preserve">Se alguém ler isso: sou a Clarice, de 1994, Processamento de Dados. Rodei um programa no terminal da Biblioteca de madrugada e PUF, vim parar aqui. Totalmente surreal.</w:t>
+              <w:t xml:space="preserve">Se alguém ler isso: sou a Clarice, de 1990, Processamento de Dados. Rodei um programa no terminal da Biblioteca de madrugada e PUF, vim parar aqui. Totalmente surreal.</w:t>
             </w:r>
           </w:p>
           <w:p>
@@ -13219,7 +13219,7 @@
                 <w:sz w:val="17"/>
                 <w:szCs w:val="17"/>
               </w:rPr>
-              <w:t xml:space="preserve">Aluna de 1994. Os robôs repetem sempre o mesmo caminho: dá para decorar.  Guardou senhas num disquete. Uma delas abre a grade do salão.  Foi para o Bloco de salas e pediu que quem chegasse a procurasse lá. Escreveu: não confie nas luzes.</w:t>
+              <w:t xml:space="preserve">Aluna de 1990. Os robôs repetem sempre o mesmo caminho: dá para decorar.  Guardou senhas num disquete. Uma delas abre a grade do salão.  Foi para o Bloco de salas e pediu que quem chegasse a procurasse lá. Escreveu: não confie nas luzes.</w:t>
             </w:r>
           </w:p>
         </w:tc>
@@ -13263,7 +13263,7 @@
                 <w:sz w:val="16"/>
                 <w:szCs w:val="16"/>
               </w:rPr>
-              <w:t xml:space="preserve">Clarice, 1994 · papel: caderno_clarice</w:t>
+              <w:t xml:space="preserve">Clarice, 1990 · papel: caderno_clarice</w:t>
             </w:r>
           </w:p>
         </w:tc>
@@ -13286,7 +13286,7 @@
           </w:tcPr>
           <w:p>
             <w:r>
-              <w:t xml:space="preserve">1994</w:t>
+              <w:t xml:space="preserve">1990</w:t>
             </w:r>
           </w:p>
         </w:tc>
@@ -15402,7 +15402,7 @@
           <w:b/>
           <w:bCs/>
         </w:rPr>
-        <w:t xml:space="preserve">Clarice, 1994.</w:t>
+        <w:t xml:space="preserve">Clarice, 1990.</w:t>
       </w:r>
       <w:r>
         <w:rPr>
@@ -15658,7 +15658,7 @@
               <w:keepNext/>
             </w:pPr>
             <w:r>
-              <w:t xml:space="preserve">No jogo</w:t>
+              <w:t xml:space="preserve">No jogo, com falas novas em rascunho</w:t>
             </w:r>
           </w:p>
         </w:tc>
@@ -15835,7 +15835,7 @@
     </w:p>
     <w:p>
       <w:pPr>
-        <w:pStyle w:val="Personagem"/>
+        <w:pStyle w:val="PersonagemNovo"/>
       </w:pPr>
       <w:r>
         <w:t xml:space="preserve">CLARICE</w:t>
@@ -15843,10 +15843,106 @@
     </w:p>
     <w:p>
       <w:pPr>
-        <w:pStyle w:val="Dialogo"/>
-      </w:pPr>
-      <w:r>
-        <w:t xml:space="preserve">Mil anos, meu filho. Mil. O Henrique garante que, de alguma forma, isso aqui é 3026. Eu fiz a conta três vezes: fecha.</w:t>
+        <w:pStyle w:val="DialogoNovo"/>
+      </w:pPr>
+      <w:r>
+        <w:t xml:space="preserve">Praticamente mil anos, meu filho. Mil. Na verdade, pra mim foi mais. Agora, você é de que ano? O Henrique garante que, de alguma forma, isso aqui é 3026. Eu fiz a conta três vezes: fecha.</w:t>
+      </w:r>
+    </w:p>
+    <w:p>
+      <w:pPr>
+        <w:pStyle w:val="PersonagemNovo"/>
+      </w:pPr>
+      <w:r>
+        <w:t xml:space="preserve">GABRIEL (surpreso)</w:t>
+      </w:r>
+    </w:p>
+    <w:p>
+      <w:pPr>
+        <w:pStyle w:val="DialogoNovo"/>
+      </w:pPr>
+      <w:r>
+        <w:t xml:space="preserve">Quê? Viagem no tempo? Isso é real? Eu sou de 2026, e você?</w:t>
+      </w:r>
+    </w:p>
+    <w:p>
+      <w:pPr>
+        <w:pStyle w:val="PersonagemNovo"/>
+      </w:pPr>
+      <w:r>
+        <w:t xml:space="preserve">CLARICE</w:t>
+      </w:r>
+    </w:p>
+    <w:p>
+      <w:pPr>
+        <w:pStyle w:val="DialogoNovo"/>
+      </w:pPr>
+      <w:r>
+        <w:t xml:space="preserve">Eu sei, calma, se é que dá pra ficar. Sou de 1990. Você é do futuro pra mim, então. Você e o Zane. Sei que parece surreal, mas basicamente cinco pessoas, contando com você, vieram parar aqui, só que não ao mesmo tempo. Eu já estou aqui há [dias dela] dias, e o Zane, há [dias dele]. Tem também o Henrique, que é a nossa esperança: ainda não nos vimos pessoalmente, mas ele nos ajudou bastante. E a, digamos, agitada Diana.</w:t>
+      </w:r>
+    </w:p>
+    <w:p>
+      <w:pPr>
+        <w:pStyle w:val="PersonagemNovo"/>
+      </w:pPr>
+      <w:r>
+        <w:t xml:space="preserve">GABRIEL</w:t>
+      </w:r>
+    </w:p>
+    <w:p>
+      <w:pPr>
+        <w:pStyle w:val="DialogoNovo"/>
+      </w:pPr>
+      <w:r>
+        <w:t xml:space="preserve">Surreal é pouco. Como a gente vai voltar? Vocês estão construindo um DeLorean, por acaso?</w:t>
+      </w:r>
+    </w:p>
+    <w:p>
+      <w:pPr>
+        <w:pStyle w:val="PersonagemNovo"/>
+      </w:pPr>
+      <w:r>
+        <w:t xml:space="preserve">CLARICE (sorrindo)</w:t>
+      </w:r>
+    </w:p>
+    <w:p>
+      <w:pPr>
+        <w:pStyle w:val="DialogoNovo"/>
+      </w:pPr>
+      <w:r>
+        <w:t xml:space="preserve">Haha, gostei da referência. Ainda se fala desse filme no futuro? Você assistiu o terceiro filme? Que azar eu ser puxada antes de assistir, eu ia nesse fim de semana.</w:t>
+      </w:r>
+    </w:p>
+    <w:p>
+      <w:pPr>
+        <w:pStyle w:val="PersonagemNovo"/>
+      </w:pPr>
+      <w:r>
+        <w:t xml:space="preserve">GABRIEL</w:t>
+      </w:r>
+    </w:p>
+    <w:p>
+      <w:pPr>
+        <w:pStyle w:val="DialogoNovo"/>
+      </w:pPr>
+      <w:r>
+        <w:t xml:space="preserve">Sim, filmaço, inclusive. Mas vamos focar primeiro em sair daqui vivos, que eu te conto tudo.</w:t>
+      </w:r>
+    </w:p>
+    <w:p>
+      <w:pPr>
+        <w:pStyle w:val="PersonagemNovo"/>
+      </w:pPr>
+      <w:r>
+        <w:t xml:space="preserve">CLARICE</w:t>
+      </w:r>
+    </w:p>
+    <w:p>
+      <w:pPr>
+        <w:pStyle w:val="DialogoNovo"/>
+      </w:pPr>
+      <w:r>
+        <w:t xml:space="preserve">Ahh, quero saber. Enfim.</w:t>
       </w:r>
     </w:p>
     <w:p>
@@ -16042,6 +16138,51 @@
       </w:pPr>
       <w:r>
         <w:t xml:space="preserve">Pisa de leve que o robô escuta. Se ele vier, joga uma pedra longe: ele vai atrás do barulho. É reflexo, eu já testei.</w:t>
+      </w:r>
+    </w:p>
+    <w:p>
+      <w:pPr>
+        <w:pStyle w:val="NotaTime"/>
+        <w:spacing w:after="60" w:before="60"/>
+      </w:pPr>
+      <w:r>
+        <w:t xml:space="preserve">Nota: Linhas com barra azul à esquerda são suas e ainda não estão no jogo. As outras já tocam.</w:t>
+      </w:r>
+    </w:p>
+    <w:p>
+      <w:pPr>
+        <w:pStyle w:val="NotaTime"/>
+        <w:spacing w:after="60" w:before="60"/>
+      </w:pPr>
+      <w:r>
+        <w:t xml:space="preserve">Nota: Só a escrita foi corrigida: Clarisse e “Calrice” viraram Clarice, e ajustei “daí”, “dá pra”, “é do futuro”, “surreal, mas”, “cinco”, “daqui”, “DeLorean” e a pontuação. Onde estava “(ano dela)”, pus 1990.</w:t>
+      </w:r>
+    </w:p>
+    <w:p>
+      <w:pPr>
+        <w:pStyle w:val="NotaTime"/>
+        <w:spacing w:after="60" w:before="60"/>
+      </w:pPr>
+      <w:r>
+        <w:t xml:space="preserve">Nota: Ficaram como [dias dela] e [dias dele] os números de dias: a história só diz “com dias de diferença”. A ordem de chegada é Henrique, Zane, Clarice, Diana e Gabriel.</w:t>
+      </w:r>
+    </w:p>
+    <w:p>
+      <w:pPr>
+        <w:pStyle w:val="NotaTime"/>
+        <w:spacing w:after="60" w:before="60"/>
+      </w:pPr>
+      <w:r>
+        <w:t xml:space="preserve">Nota: Marquei o retrato do Gabriel como “surpreso” na primeira fala nova (você não indicou). Troque se preferir.</w:t>
+      </w:r>
+    </w:p>
+    <w:p>
+      <w:pPr>
+        <w:pStyle w:val="NotaTime"/>
+        <w:spacing w:after="60" w:before="60"/>
+      </w:pPr>
+      <w:r>
+        <w:t xml:space="preserve">Nota: Revisão do Ato 2 no Anexo B.</w:t>
       </w:r>
     </w:p>
     <w:p>
@@ -17460,7 +17601,7 @@
           <w:b/>
           <w:bCs/>
         </w:rPr>
-        <w:t xml:space="preserve">Clarice, 1994.</w:t>
+        <w:t xml:space="preserve">Clarice, 1990.</w:t>
       </w:r>
       <w:r>
         <w:rPr>
@@ -17790,7 +17931,7 @@
           <w:b/>
           <w:bCs/>
         </w:rPr>
-        <w:t xml:space="preserve">Clarice, 1994.</w:t>
+        <w:t xml:space="preserve">Clarice, 1990.</w:t>
       </w:r>
       <w:r>
         <w:rPr>
@@ -18120,7 +18261,7 @@
           <w:b/>
           <w:bCs/>
         </w:rPr>
-        <w:t xml:space="preserve">Clarice, 1994.</w:t>
+        <w:t xml:space="preserve">Clarice, 1990.</w:t>
       </w:r>
       <w:r>
         <w:rPr>
@@ -18865,7 +19006,7 @@
           </w:tcPr>
           <w:p>
             <w:r>
-              <w:t xml:space="preserve">Ela perdeu o molho de chaves na 102 e propõe uma permuta.</w:t>
+              <w:t xml:space="preserve">Ela perdeu o molho de chaves na 102 e propõe uma permuta. Se o Gabriel perguntar do lugar, ela conta quem mais veio parar ali.</w:t>
             </w:r>
           </w:p>
         </w:tc>
@@ -37910,6 +38051,182 @@
         <w:pStyle w:val="Heading2"/>
       </w:pPr>
       <w:r>
+        <w:t xml:space="preserve">Revisão do Ato 2 (Bloco de salas)</w:t>
+      </w:r>
+    </w:p>
+    <w:p>
+      <w:pPr>
+        <w:spacing w:after="100"/>
+      </w:pPr>
+      <w:r>
+        <w:t xml:space="preserve">As falas novas estão na cena 2.2, no trecho “lugar” do primeiro encontro com a Clarice.</w:t>
+      </w:r>
+    </w:p>
+    <w:p>
+      <w:pPr>
+        <w:pStyle w:val="ListParagraph"/>
+        <w:numPr>
+          <w:ilvl w:val="0"/>
+          <w:numId w:val="2"/>
+        </w:numPr>
+        <w:spacing w:after="80"/>
+      </w:pPr>
+      <w:r>
+        <w:rPr>
+          <w:b/>
+          <w:bCs/>
+        </w:rPr>
+        <w:t xml:space="preserve">1. O que funcionou.</w:t>
+      </w:r>
+      <w:r>
+        <w:t xml:space="preserve"> O duelo de ironias entre o Gabriel e a Clarice (“Surreal é pouco” e o DeLorean) é o que a ficha pede para os dois. O DeLorean também encaixa no 1990 da Clarice: De Volta para o Futuro Parte III é um filme de 1990, e “eu ia nesse fim de semana” fica coerente. A conta dela também fecha: de 1990 a 3026 são 1036 anos, então “mil anos, pra mim foi mais” está certo. E o Henrique como “nossa esperança” prepara bem a virada dele.</w:t>
+      </w:r>
+    </w:p>
+    <w:p>
+      <w:pPr>
+        <w:pStyle w:val="ListParagraph"/>
+        <w:numPr>
+          <w:ilvl w:val="0"/>
+          <w:numId w:val="2"/>
+        </w:numPr>
+        <w:spacing w:after="80"/>
+      </w:pPr>
+      <w:r>
+        <w:rPr>
+          <w:b/>
+          <w:bCs/>
+        </w:rPr>
+        <w:t xml:space="preserve">2. O Gabriel já sabe o ano dela.</w:t>
+      </w:r>
+      <w:r>
+        <w:t xml:space="preserve"> O bilhete da cena 1.6 diz “Clarice, de 1990”, e o Caderno anota “Aluna de 1990”. Aqui ele pergunta “e você?” como se fosse novidade. Sugestão: “2026. O seu eu já sei, li no bilhete.”</w:t>
+      </w:r>
+    </w:p>
+    <w:p>
+      <w:pPr>
+        <w:pStyle w:val="ListParagraph"/>
+        <w:numPr>
+          <w:ilvl w:val="0"/>
+          <w:numId w:val="2"/>
+        </w:numPr>
+        <w:spacing w:after="80"/>
+      </w:pPr>
+      <w:r>
+        <w:rPr>
+          <w:b/>
+          <w:bCs/>
+        </w:rPr>
+        <w:t xml:space="preserve">3. A informação mais importante está num ramo opcional.</w:t>
+      </w:r>
+      <w:r>
+        <w:t xml:space="preserve"> Quem escolher “Preciso sair daqui” nunca ouve que há mais gente, de outras épocas, nem que o Henrique e a Diana existem. Vale decidir se isso sai do ramo “lugar” ou se a cena 2.4 reconta.</w:t>
+      </w:r>
+    </w:p>
+    <w:p>
+      <w:pPr>
+        <w:pStyle w:val="ListParagraph"/>
+        <w:numPr>
+          <w:ilvl w:val="0"/>
+          <w:numId w:val="2"/>
+        </w:numPr>
+        <w:spacing w:after="80"/>
+      </w:pPr>
+      <w:r>
+        <w:rPr>
+          <w:b/>
+          <w:bCs/>
+        </w:rPr>
+        <w:t xml:space="preserve">4. Repete e contradiz a cena 2.4.</w:t>
+      </w:r>
+      <w:r>
+        <w:t xml:space="preserve"> Na permuta a Clarice conta de novo que a Diana chegou depois e que o Henrique vê pelas câmeras e avisou do 3026. Dá para cortar. Além disso, a anotação do Caderno dessa conversa diz “A Clarice chegou primeiro”, o que contradiz a história (o Henrique é o primeiro e o Zane chega antes dela) e a fala nova (“não ao mesmo tempo”). Sugestão: “A Clarice chegou antes de mim.” Fica no arquivo dados/dialogos/clarice_bloco_devolve_chave.json.</w:t>
+      </w:r>
+    </w:p>
+    <w:p>
+      <w:pPr>
+        <w:pStyle w:val="ListParagraph"/>
+        <w:numPr>
+          <w:ilvl w:val="0"/>
+          <w:numId w:val="2"/>
+        </w:numPr>
+        <w:spacing w:after="80"/>
+      </w:pPr>
+      <w:r>
+        <w:rPr>
+          <w:b/>
+          <w:bCs/>
+        </w:rPr>
+        <w:t xml:space="preserve">5. Cinco pessoas e o Baltazar.</w:t>
+      </w:r>
+      <w:r>
+        <w:t xml:space="preserve"> Gabriel, Clarice, Zane, Henrique e Diana são cinco, e o Baltazar fica de fora. Pela história ele se isolou e não está no rádio, então a Clarice pode mesmo não saber dele. Se for assim, “cinco” está certo. Se ela sabe, são seis.</w:t>
+      </w:r>
+    </w:p>
+    <w:p>
+      <w:pPr>
+        <w:pStyle w:val="ListParagraph"/>
+        <w:numPr>
+          <w:ilvl w:val="0"/>
+          <w:numId w:val="2"/>
+        </w:numPr>
+        <w:spacing w:after="80"/>
+      </w:pPr>
+      <w:r>
+        <w:rPr>
+          <w:b/>
+          <w:bCs/>
+        </w:rPr>
+        <w:t xml:space="preserve">6. Os dias.</w:t>
+      </w:r>
+      <w:r>
+        <w:t xml:space="preserve"> Faltam os números de [dias dela] e [dias dele]. A ordem é Henrique, Zane, Clarice, Diana. Se não quiserem fixar, “faz uns dias” serve.</w:t>
+      </w:r>
+    </w:p>
+    <w:p>
+      <w:pPr>
+        <w:pStyle w:val="ListParagraph"/>
+        <w:numPr>
+          <w:ilvl w:val="0"/>
+          <w:numId w:val="2"/>
+        </w:numPr>
+        <w:spacing w:after="80"/>
+      </w:pPr>
+      <w:r>
+        <w:rPr>
+          <w:b/>
+          <w:bCs/>
+        </w:rPr>
+        <w:t xml:space="preserve">7. O tom do Gabriel (lembrete).</w:t>
+      </w:r>
+      <w:r>
+        <w:t xml:space="preserve"> “QUE? Viagem no tempo? Isso é real?” são três perguntas seguidas, e a ficha pede frases curtas e ironia seca. O DeLorean está no tom. Exemplo para a primeira: “Mil anos. Ótimo. E a lista de equações, como fica?”</w:t>
+      </w:r>
+    </w:p>
+    <w:p>
+      <w:pPr>
+        <w:pStyle w:val="ListParagraph"/>
+        <w:numPr>
+          <w:ilvl w:val="0"/>
+          <w:numId w:val="2"/>
+        </w:numPr>
+        <w:spacing w:after="80"/>
+      </w:pPr>
+      <w:r>
+        <w:rPr>
+          <w:b/>
+          <w:bCs/>
+        </w:rPr>
+        <w:t xml:space="preserve">8. Fala longa demais.</w:t>
+      </w:r>
+      <w:r>
+        <w:t xml:space="preserve"> A terceira fala da Clarice tem cerca de 90 palavras numa caixa só. No jogo cada fala é uma caixa, então vale quebrar em três ou quatro.</w:t>
+      </w:r>
+    </w:p>
+    <w:p>
+      <w:pPr>
+        <w:pStyle w:val="Heading2"/>
+      </w:pPr>
+      <w:r>
         <w:t xml:space="preserve">Diálogos que existem nos arquivos, mas não tocam no jogo</w:t>
       </w:r>
     </w:p>
@@ -39359,6 +39676,200 @@
       </w:tr>
       <w:tr>
         <w:trPr>
+          <w:trHeight w:val="480" w:hRule="atLeast"/>
+        </w:trPr>
+        <w:tc>
+          <w:tcPr>
+            <w:tcW w:type="dxa" w:w="1100"/>
+            <w:tcBorders>
+              <w:top w:val="single" w:color="BFC9D1" w:sz="4"/>
+              <w:left w:val="single" w:color="BFC9D1" w:sz="4"/>
+              <w:bottom w:val="single" w:color="BFC9D1" w:sz="4"/>
+              <w:right w:val="single" w:color="BFC9D1" w:sz="4"/>
+            </w:tcBorders>
+            <w:tcMar>
+              <w:top w:type="dxa" w:w="70"/>
+              <w:left w:type="dxa" w:w="110"/>
+              <w:bottom w:type="dxa" w:w="70"/>
+              <w:right w:type="dxa" w:w="110"/>
+            </w:tcMar>
+            <w:vAlign w:val="top"/>
+          </w:tcPr>
+          <w:p>
+            <w:r>
+              <w:t xml:space="preserve">0.5</w:t>
+            </w:r>
+          </w:p>
+        </w:tc>
+        <w:tc>
+          <w:tcPr>
+            <w:tcW w:type="dxa" w:w="1400"/>
+            <w:tcBorders>
+              <w:top w:val="single" w:color="BFC9D1" w:sz="4"/>
+              <w:left w:val="single" w:color="BFC9D1" w:sz="4"/>
+              <w:bottom w:val="single" w:color="BFC9D1" w:sz="4"/>
+              <w:right w:val="single" w:color="BFC9D1" w:sz="4"/>
+            </w:tcBorders>
+            <w:tcMar>
+              <w:top w:type="dxa" w:w="70"/>
+              <w:left w:type="dxa" w:w="110"/>
+              <w:bottom w:type="dxa" w:w="70"/>
+              <w:right w:type="dxa" w:w="110"/>
+            </w:tcMar>
+            <w:vAlign w:val="top"/>
+          </w:tcPr>
+          <w:p>
+            <w:r>
+              <w:t xml:space="preserve">18/10/2026</w:t>
+            </w:r>
+          </w:p>
+        </w:tc>
+        <w:tc>
+          <w:tcPr>
+            <w:tcW w:type="dxa" w:w="2000"/>
+            <w:tcBorders>
+              <w:top w:val="single" w:color="BFC9D1" w:sz="4"/>
+              <w:left w:val="single" w:color="BFC9D1" w:sz="4"/>
+              <w:bottom w:val="single" w:color="BFC9D1" w:sz="4"/>
+              <w:right w:val="single" w:color="BFC9D1" w:sz="4"/>
+            </w:tcBorders>
+            <w:tcMar>
+              <w:top w:type="dxa" w:w="70"/>
+              <w:left w:type="dxa" w:w="110"/>
+              <w:bottom w:type="dxa" w:w="70"/>
+              <w:right w:type="dxa" w:w="110"/>
+            </w:tcMar>
+            <w:vAlign w:val="top"/>
+          </w:tcPr>
+          <w:p>
+            <w:r>
+              <w:t xml:space="preserve"/>
+            </w:r>
+          </w:p>
+        </w:tc>
+        <w:tc>
+          <w:tcPr>
+            <w:tcW w:type="dxa" w:w="4526"/>
+            <w:tcBorders>
+              <w:top w:val="single" w:color="BFC9D1" w:sz="4"/>
+              <w:left w:val="single" w:color="BFC9D1" w:sz="4"/>
+              <w:bottom w:val="single" w:color="BFC9D1" w:sz="4"/>
+              <w:right w:val="single" w:color="BFC9D1" w:sz="4"/>
+            </w:tcBorders>
+            <w:tcMar>
+              <w:top w:type="dxa" w:w="70"/>
+              <w:left w:type="dxa" w:w="110"/>
+              <w:bottom w:type="dxa" w:w="70"/>
+              <w:right w:type="dxa" w:w="110"/>
+            </w:tcMar>
+            <w:vAlign w:val="top"/>
+          </w:tcPr>
+          <w:p>
+            <w:r>
+              <w:t xml:space="preserve">A Clarice passa a ser de 1990 (antes 1994).</w:t>
+            </w:r>
+          </w:p>
+        </w:tc>
+      </w:tr>
+      <w:tr>
+        <w:trPr>
+          <w:trHeight w:val="480" w:hRule="atLeast"/>
+        </w:trPr>
+        <w:tc>
+          <w:tcPr>
+            <w:tcW w:type="dxa" w:w="1100"/>
+            <w:tcBorders>
+              <w:top w:val="single" w:color="BFC9D1" w:sz="4"/>
+              <w:left w:val="single" w:color="BFC9D1" w:sz="4"/>
+              <w:bottom w:val="single" w:color="BFC9D1" w:sz="4"/>
+              <w:right w:val="single" w:color="BFC9D1" w:sz="4"/>
+            </w:tcBorders>
+            <w:tcMar>
+              <w:top w:type="dxa" w:w="70"/>
+              <w:left w:type="dxa" w:w="110"/>
+              <w:bottom w:type="dxa" w:w="70"/>
+              <w:right w:type="dxa" w:w="110"/>
+            </w:tcMar>
+            <w:vAlign w:val="top"/>
+          </w:tcPr>
+          <w:p>
+            <w:r>
+              <w:t xml:space="preserve">0.6</w:t>
+            </w:r>
+          </w:p>
+        </w:tc>
+        <w:tc>
+          <w:tcPr>
+            <w:tcW w:type="dxa" w:w="1400"/>
+            <w:tcBorders>
+              <w:top w:val="single" w:color="BFC9D1" w:sz="4"/>
+              <w:left w:val="single" w:color="BFC9D1" w:sz="4"/>
+              <w:bottom w:val="single" w:color="BFC9D1" w:sz="4"/>
+              <w:right w:val="single" w:color="BFC9D1" w:sz="4"/>
+            </w:tcBorders>
+            <w:tcMar>
+              <w:top w:type="dxa" w:w="70"/>
+              <w:left w:type="dxa" w:w="110"/>
+              <w:bottom w:type="dxa" w:w="70"/>
+              <w:right w:type="dxa" w:w="110"/>
+            </w:tcMar>
+            <w:vAlign w:val="top"/>
+          </w:tcPr>
+          <w:p>
+            <w:r>
+              <w:t xml:space="preserve">18/10/2026</w:t>
+            </w:r>
+          </w:p>
+        </w:tc>
+        <w:tc>
+          <w:tcPr>
+            <w:tcW w:type="dxa" w:w="2000"/>
+            <w:tcBorders>
+              <w:top w:val="single" w:color="BFC9D1" w:sz="4"/>
+              <w:left w:val="single" w:color="BFC9D1" w:sz="4"/>
+              <w:bottom w:val="single" w:color="BFC9D1" w:sz="4"/>
+              <w:right w:val="single" w:color="BFC9D1" w:sz="4"/>
+            </w:tcBorders>
+            <w:tcMar>
+              <w:top w:type="dxa" w:w="70"/>
+              <w:left w:type="dxa" w:w="110"/>
+              <w:bottom w:type="dxa" w:w="70"/>
+              <w:right w:type="dxa" w:w="110"/>
+            </w:tcMar>
+            <w:vAlign w:val="top"/>
+          </w:tcPr>
+          <w:p>
+            <w:r>
+              <w:t xml:space="preserve"/>
+            </w:r>
+          </w:p>
+        </w:tc>
+        <w:tc>
+          <w:tcPr>
+            <w:tcW w:type="dxa" w:w="4526"/>
+            <w:tcBorders>
+              <w:top w:val="single" w:color="BFC9D1" w:sz="4"/>
+              <w:left w:val="single" w:color="BFC9D1" w:sz="4"/>
+              <w:bottom w:val="single" w:color="BFC9D1" w:sz="4"/>
+              <w:right w:val="single" w:color="BFC9D1" w:sz="4"/>
+            </w:tcBorders>
+            <w:tcMar>
+              <w:top w:type="dxa" w:w="70"/>
+              <w:left w:type="dxa" w:w="110"/>
+              <w:bottom w:type="dxa" w:w="70"/>
+              <w:right w:type="dxa" w:w="110"/>
+            </w:tcMar>
+            <w:vAlign w:val="top"/>
+          </w:tcPr>
+          <w:p>
+            <w:r>
+              <w:t xml:space="preserve">Falas novas da cena 2.2 estruturadas; revisão do Ato 2 no Anexo B.</w:t>
+            </w:r>
+          </w:p>
+        </w:tc>
+      </w:tr>
+      <w:tr>
+        <w:trPr>
           <w:trHeight w:val="560" w:hRule="atLeast"/>
         </w:trPr>
         <w:tc>
@@ -39615,7 +40126,7 @@
         <w:sz w:val="17"/>
         <w:szCs w:val="17"/>
       </w:rPr>
-      <w:t xml:space="preserve">Versão 0.4 — Rascunho</w:t>
+      <w:t xml:space="preserve">Versão 0.6 — Rascunho</w:t>
     </w:r>
     <w:r>
       <w:rPr>

</xml_diff>

<commit_message>
docs: cada chegada a 3026 vem 3 dias depois da anterior; cena 2.2 revisada
Registra os 3 dias de intervalo na História Completa, no GDD e em decisoes.md.
No Roteiro, a cena 2.2 perde o ramo opcional, ganha os dias da Clarice e a
fala longa dela é quebrada. O Anexo B mostra onde está a ordem de chegada.

Co-Authored-By: Claude Sonnet 5.5 <noreply@anthropic.com>
</commit_message>
<xml_diff>
--- a/docs/historia/roteiro/Roteiro.docx
+++ b/docs/historia/roteiro/Roteiro.docx
@@ -126,7 +126,7 @@
           </w:tcPr>
           <w:p>
             <w:r>
-              <w:t xml:space="preserve">0.6 — Rascunho</w:t>
+              <w:t xml:space="preserve">0.7 — Rascunho</w:t>
             </w:r>
           </w:p>
         </w:tc>
@@ -15776,46 +15776,10 @@
     </w:p>
     <w:p>
       <w:pPr>
-        <w:pStyle w:val="Escolha"/>
-      </w:pPr>
-      <w:r>
-        <w:rPr>
-          <w:b/>
-          <w:bCs/>
-          <w:color w:val="2A7F8E"/>
-        </w:rPr>
-        <w:t xml:space="preserve">ESCOLHA  </w:t>
-      </w:r>
-      <w:r>
-        <w:t xml:space="preserve">“O que aconteceu com este lugar?”</w:t>
-      </w:r>
-      <w:r>
-        <w:rPr>
-          <w:color w:val="7A8794"/>
-        </w:rPr>
-        <w:t xml:space="preserve">   → lugar</w:t>
-      </w:r>
-    </w:p>
-    <w:p>
-      <w:pPr>
-        <w:pStyle w:val="Escolha"/>
-      </w:pPr>
-      <w:r>
-        <w:rPr>
-          <w:b/>
-          <w:bCs/>
-          <w:color w:val="2A7F8E"/>
-        </w:rPr>
-        <w:t xml:space="preserve">ESCOLHA  </w:t>
-      </w:r>
-      <w:r>
-        <w:t xml:space="preserve">“Preciso sair daqui.”</w:t>
-      </w:r>
-      <w:r>
-        <w:rPr>
-          <w:color w:val="7A8794"/>
-        </w:rPr>
-        <w:t xml:space="preserve">   → molho</w:t>
+        <w:pStyle w:val="Fluxo"/>
+      </w:pPr>
+      <w:r>
+        <w:t xml:space="preserve">segue para o trecho lugar</w:t>
       </w:r>
     </w:p>
     <w:p>
@@ -15862,7 +15826,7 @@
         <w:pStyle w:val="DialogoNovo"/>
       </w:pPr>
       <w:r>
-        <w:t xml:space="preserve">Quê? Viagem no tempo? Isso é real? Eu sou de 2026, e você?</w:t>
+        <w:t xml:space="preserve">Quê? Viagem no tempo? Isso é real? Eu sou de 2026. O seu eu já sei, li no bilhete.</w:t>
       </w:r>
     </w:p>
     <w:p>
@@ -15878,7 +15842,31 @@
         <w:pStyle w:val="DialogoNovo"/>
       </w:pPr>
       <w:r>
-        <w:t xml:space="preserve">Eu sei, calma, se é que dá pra ficar. Sou de 1990. Você é do futuro pra mim, então. Você e o Zane. Sei que parece surreal, mas basicamente cinco pessoas, contando com você, vieram parar aqui, só que não ao mesmo tempo. Eu já estou aqui há [dias dela] dias, e o Zane, há [dias dele]. Tem também o Henrique, que é a nossa esperança: ainda não nos vimos pessoalmente, mas ele nos ajudou bastante. E a, digamos, agitada Diana.</w:t>
+        <w:t xml:space="preserve">Eu sei, calma, se é que dá pra ficar. O bilhete, claro. Então você é do futuro pra mim. Você e o Zane.</w:t>
+      </w:r>
+    </w:p>
+    <w:p>
+      <w:pPr>
+        <w:pStyle w:val="DialogoNovo"/>
+      </w:pPr>
+      <w:r>
+        <w:t xml:space="preserve">Sei que parece surreal, mas basicamente cinco pessoas, contando com você, vieram parar aqui, só que não ao mesmo tempo.</w:t>
+      </w:r>
+    </w:p>
+    <w:p>
+      <w:pPr>
+        <w:pStyle w:val="DialogoNovo"/>
+      </w:pPr>
+      <w:r>
+        <w:t xml:space="preserve">Eu já estou aqui há seis dias, e o Zane, há nove.</w:t>
+      </w:r>
+    </w:p>
+    <w:p>
+      <w:pPr>
+        <w:pStyle w:val="DialogoNovo"/>
+      </w:pPr>
+      <w:r>
+        <w:t xml:space="preserve">Tem também o Henrique, que é a nossa esperança: ainda não nos vimos pessoalmente, mas ele nos ajudou bastante. E a, digamos, agitada Diana.</w:t>
       </w:r>
     </w:p>
     <w:p>
@@ -16155,7 +16143,7 @@
         <w:spacing w:after="60" w:before="60"/>
       </w:pPr>
       <w:r>
-        <w:t xml:space="preserve">Nota: Só a escrita foi corrigida: Clarisse e “Calrice” viraram Clarice, e ajustei “daí”, “dá pra”, “é do futuro”, “surreal, mas”, “cinco”, “daqui”, “DeLorean” e a pontuação. Onde estava “(ano dela)”, pus 1990.</w:t>
+        <w:t xml:space="preserve">Nota: Só a escrita foi corrigida: Clarisse e “Calrice” viraram Clarice, e ajustei “daí”, “dá pra”, “é do futuro”, “surreal, mas”, “cinco”, “daqui”, “DeLorean” e a pontuação. O retrato “surpreso” do Gabriel é meu, porque você não indicou.</w:t>
       </w:r>
     </w:p>
     <w:p>
@@ -16164,7 +16152,7 @@
         <w:spacing w:after="60" w:before="60"/>
       </w:pPr>
       <w:r>
-        <w:t xml:space="preserve">Nota: Ficaram como [dias dela] e [dias dele] os números de dias: a história só diz “com dias de diferença”. A ordem de chegada é Henrique, Zane, Clarice, Diana e Gabriel.</w:t>
+        <w:t xml:space="preserve">Nota: Decidido nesta rodada: tirei as duas escolhas (“O que aconteceu com este lugar?” e “Preciso sair daqui.”). Agora a Clarice sempre conta isso e depois segue para o molho. O arquivo do jogo ainda tem as escolhas. A fala longa dela foi quebrada em quatro, e o Gabriel diz que já sabe o ano dela pelo bilhete. A reação da Clarice a isso (“O bilhete, claro.”) é minha, ajuste se quiser.</w:t>
       </w:r>
     </w:p>
     <w:p>
@@ -16173,7 +16161,7 @@
         <w:spacing w:after="60" w:before="60"/>
       </w:pPr>
       <w:r>
-        <w:t xml:space="preserve">Nota: Marquei o retrato do Gabriel como “surpreso” na primeira fala nova (você não indicou). Troque se preferir.</w:t>
+        <w:t xml:space="preserve">Nota: Dias contados a partir da chegada do Gabriel, com 3 dias entre cada chegada: Diana 3, Clarice 6, Zane 9, Henrique 12. Se o Baltazar entrar antes da Clarice, os números dela e do Zane sobem 3 (História Completa, 10.4).</w:t>
       </w:r>
     </w:p>
     <w:p>
@@ -22313,6 +22301,15 @@
     </w:p>
     <w:p>
       <w:pPr>
+        <w:pStyle w:val="NotaTime"/>
+        <w:spacing w:after="60" w:before="60"/>
+      </w:pPr>
+      <w:r>
+        <w:t xml:space="preserve">Nota: Decidido em 18/10: o grupo só descobre o Baltazar no Ato 3, pelo Zane. Antes disso a Clarice não sabe dele (por isso ela diz “cinco pessoas”). Falta escrever essa fala.</w:t>
+      </w:r>
+    </w:p>
+    <w:p>
+      <w:pPr>
         <w:spacing w:after="200"/>
       </w:pPr>
     </w:p>
@@ -38059,7 +38056,7 @@
         <w:spacing w:after="100"/>
       </w:pPr>
       <w:r>
-        <w:t xml:space="preserve">As falas novas estão na cena 2.2, no trecho “lugar” do primeiro encontro com a Clarice.</w:t>
+        <w:t xml:space="preserve">As falas novas estão na cena 2.2. Cada item diz se foi aplicado, decidido ou se ainda espera resposta.</w:t>
       </w:r>
     </w:p>
     <w:p>
@@ -38079,7 +38076,7 @@
         <w:t xml:space="preserve">1. O que funcionou.</w:t>
       </w:r>
       <w:r>
-        <w:t xml:space="preserve"> O duelo de ironias entre o Gabriel e a Clarice (“Surreal é pouco” e o DeLorean) é o que a ficha pede para os dois. O DeLorean também encaixa no 1990 da Clarice: De Volta para o Futuro Parte III é um filme de 1990, e “eu ia nesse fim de semana” fica coerente. A conta dela também fecha: de 1990 a 3026 são 1036 anos, então “mil anos, pra mim foi mais” está certo. E o Henrique como “nossa esperança” prepara bem a virada dele.</w:t>
+        <w:t xml:space="preserve"> O duelo de ironias entre o Gabriel e a Clarice (“Surreal é pouco” e o DeLorean) é o que a ficha pede para os dois. O DeLorean também encaixa no 1990 da Clarice: De Volta para o Futuro Parte III é um filme de 1990, e “eu ia nesse fim de semana” fica coerente. A conta dela fecha: de 1990 a 3026 são 1036 anos. E o Henrique como “nossa esperança” prepara bem a virada dele.</w:t>
       </w:r>
     </w:p>
     <w:p>
@@ -38096,10 +38093,10 @@
           <w:b/>
           <w:bCs/>
         </w:rPr>
-        <w:t xml:space="preserve">2. O Gabriel já sabe o ano dela.</w:t>
-      </w:r>
-      <w:r>
-        <w:t xml:space="preserve"> O bilhete da cena 1.6 diz “Clarice, de 1990”, e o Caderno anota “Aluna de 1990”. Aqui ele pergunta “e você?” como se fosse novidade. Sugestão: “2026. O seu eu já sei, li no bilhete.”</w:t>
+        <w:t xml:space="preserve">2. Os dias. Aplicado.</w:t>
+      </w:r>
+      <w:r>
+        <w:t xml:space="preserve"> Cada chegada vem 3 dias depois da anterior (registrado na História Completa e em docs/decisoes.md). Contando a partir da chegada do Gabriel: Diana 3, Clarice 6, Zane 9, Henrique 12. A Clarice diz “seis dias” e “nove”. Se o Baltazar entrar antes da Clarice, os dois números sobem 3.</w:t>
       </w:r>
     </w:p>
     <w:p>
@@ -38116,10 +38113,10 @@
           <w:b/>
           <w:bCs/>
         </w:rPr>
-        <w:t xml:space="preserve">3. A informação mais importante está num ramo opcional.</w:t>
-      </w:r>
-      <w:r>
-        <w:t xml:space="preserve"> Quem escolher “Preciso sair daqui” nunca ouve que há mais gente, de outras épocas, nem que o Henrique e a Diana existem. Vale decidir se isso sai do ramo “lugar” ou se a cena 2.4 reconta.</w:t>
+        <w:t xml:space="preserve">3. Cinco pessoas e o Baltazar. Decidido.</w:t>
+      </w:r>
+      <w:r>
+        <w:t xml:space="preserve"> A Clarice não sabe do Baltazar, então “cinco” fica. O grupo descobre o Baltazar no Ato 3, pelo Zane (nota na cena 3.1).</w:t>
       </w:r>
     </w:p>
     <w:p>
@@ -38136,10 +38133,10 @@
           <w:b/>
           <w:bCs/>
         </w:rPr>
-        <w:t xml:space="preserve">4. Repete e contradiz a cena 2.4.</w:t>
-      </w:r>
-      <w:r>
-        <w:t xml:space="preserve"> Na permuta a Clarice conta de novo que a Diana chegou depois e que o Henrique vê pelas câmeras e avisou do 3026. Dá para cortar. Além disso, a anotação do Caderno dessa conversa diz “A Clarice chegou primeiro”, o que contradiz a história (o Henrique é o primeiro e o Zane chega antes dela) e a fala nova (“não ao mesmo tempo”). Sugestão: “A Clarice chegou antes de mim.” Fica no arquivo dados/dialogos/clarice_bloco_devolve_chave.json.</w:t>
+        <w:t xml:space="preserve">4. O ano da Clarice. Aplicado.</w:t>
+      </w:r>
+      <w:r>
+        <w:t xml:space="preserve"> O Gabriel diz que já sabe pelo bilhete, e a Clarice reage. A reação dela é minha.</w:t>
       </w:r>
     </w:p>
     <w:p>
@@ -38156,10 +38153,10 @@
           <w:b/>
           <w:bCs/>
         </w:rPr>
-        <w:t xml:space="preserve">5. Cinco pessoas e o Baltazar.</w:t>
-      </w:r>
-      <w:r>
-        <w:t xml:space="preserve"> Gabriel, Clarice, Zane, Henrique e Diana são cinco, e o Baltazar fica de fora. Pela história ele se isolou e não está no rádio, então a Clarice pode mesmo não saber dele. Se for assim, “cinco” está certo. Se ela sabe, são seis.</w:t>
+        <w:t xml:space="preserve">5. O ramo opcional. Aplicado.</w:t>
+      </w:r>
+      <w:r>
+        <w:t xml:space="preserve"> Tirei as duas escolhas, então todo jogador ouve que há mais gente e de outras épocas. No arquivo do jogo as escolhas ainda existem.</w:t>
       </w:r>
     </w:p>
     <w:p>
@@ -38176,10 +38173,10 @@
           <w:b/>
           <w:bCs/>
         </w:rPr>
-        <w:t xml:space="preserve">6. Os dias.</w:t>
-      </w:r>
-      <w:r>
-        <w:t xml:space="preserve"> Faltam os números de [dias dela] e [dias dele]. A ordem é Henrique, Zane, Clarice, Diana. Se não quiserem fixar, “faz uns dias” serve.</w:t>
+        <w:t xml:space="preserve">6. Fala longa. Aplicado.</w:t>
+      </w:r>
+      <w:r>
+        <w:t xml:space="preserve"> A terceira fala da Clarice virou quatro.</w:t>
       </w:r>
     </w:p>
     <w:p>
@@ -38196,10 +38193,10 @@
           <w:b/>
           <w:bCs/>
         </w:rPr>
-        <w:t xml:space="preserve">7. O tom do Gabriel (lembrete).</w:t>
-      </w:r>
-      <w:r>
-        <w:t xml:space="preserve"> “QUE? Viagem no tempo? Isso é real?” são três perguntas seguidas, e a ficha pede frases curtas e ironia seca. O DeLorean está no tom. Exemplo para a primeira: “Mil anos. Ótimo. E a lista de equações, como fica?”</w:t>
+        <w:t xml:space="preserve">7. Repete e contradiz a cena 2.4. Aguarda resposta.</w:t>
+      </w:r>
+      <w:r>
+        <w:t xml:space="preserve"> Na permuta a Clarice conta de novo que a Diana chegou depois e que o Henrique avisou do 3026: dá para cortar. E a anotação do Caderno dessa conversa diz “A Clarice chegou primeiro”, o que contradiz a história e a fala nova. Sugestão: “A Clarice chegou antes de mim.” Fica em dados/dialogos/clarice_bloco_devolve_chave.json.</w:t>
       </w:r>
     </w:p>
     <w:p>
@@ -38216,10 +38213,412 @@
           <w:b/>
           <w:bCs/>
         </w:rPr>
-        <w:t xml:space="preserve">8. Fala longa demais.</w:t>
-      </w:r>
-      <w:r>
-        <w:t xml:space="preserve"> A terceira fala da Clarice tem cerca de 90 palavras numa caixa só. No jogo cada fala é uma caixa, então vale quebrar em três ou quatro.</w:t>
+        <w:t xml:space="preserve">8. O tom do Gabriel (lembrete).</w:t>
+      </w:r>
+      <w:r>
+        <w:t xml:space="preserve"> “Quê? Viagem no tempo? Isso é real?” são três perguntas seguidas, e a ficha pede frases curtas e ironia seca. O DeLorean está no tom. Exemplo para a primeira: “Mil anos. Ótimo. E a lista de equações, como fica?”</w:t>
+      </w:r>
+    </w:p>
+    <w:p>
+      <w:pPr>
+        <w:pStyle w:val="Heading2"/>
+      </w:pPr>
+      <w:r>
+        <w:t xml:space="preserve">Ordem de chegada: onde está nos documentos</w:t>
+      </w:r>
+    </w:p>
+    <w:tbl>
+      <w:tblPr>
+        <w:tblW w:type="dxa" w:w="9026"/>
+        <w:tblBorders>
+          <w:top w:val="single" w:color="auto" w:sz="4"/>
+          <w:left w:val="single" w:color="auto" w:sz="4"/>
+          <w:bottom w:val="single" w:color="auto" w:sz="4"/>
+          <w:right w:val="single" w:color="auto" w:sz="4"/>
+          <w:insideH w:val="single" w:color="auto" w:sz="4"/>
+          <w:insideV w:val="single" w:color="auto" w:sz="4"/>
+        </w:tblBorders>
+      </w:tblPr>
+      <w:tblGrid>
+        <w:gridCol w:w="3600"/>
+        <w:gridCol w:w="5426"/>
+      </w:tblGrid>
+      <w:tr>
+        <w:trPr>
+          <w:tblHeader/>
+        </w:trPr>
+        <w:tc>
+          <w:tcPr>
+            <w:tcW w:type="dxa" w:w="3600"/>
+            <w:tcBorders>
+              <w:top w:val="single" w:color="BFC9D1" w:sz="4"/>
+              <w:left w:val="single" w:color="BFC9D1" w:sz="4"/>
+              <w:bottom w:val="single" w:color="BFC9D1" w:sz="4"/>
+              <w:right w:val="single" w:color="BFC9D1" w:sz="4"/>
+            </w:tcBorders>
+            <w:shd w:fill="1F2A3C" w:color="auto" w:val="clear"/>
+            <w:tcMar>
+              <w:top w:type="dxa" w:w="70"/>
+              <w:left w:type="dxa" w:w="110"/>
+              <w:bottom w:type="dxa" w:w="70"/>
+              <w:right w:type="dxa" w:w="110"/>
+            </w:tcMar>
+            <w:vAlign w:val="top"/>
+          </w:tcPr>
+          <w:p>
+            <w:r>
+              <w:rPr>
+                <w:b/>
+                <w:bCs/>
+                <w:color w:val="FFFFFF"/>
+              </w:rPr>
+              <w:t xml:space="preserve">Documento</w:t>
+            </w:r>
+          </w:p>
+        </w:tc>
+        <w:tc>
+          <w:tcPr>
+            <w:tcW w:type="dxa" w:w="5426"/>
+            <w:tcBorders>
+              <w:top w:val="single" w:color="BFC9D1" w:sz="4"/>
+              <w:left w:val="single" w:color="BFC9D1" w:sz="4"/>
+              <w:bottom w:val="single" w:color="BFC9D1" w:sz="4"/>
+              <w:right w:val="single" w:color="BFC9D1" w:sz="4"/>
+            </w:tcBorders>
+            <w:shd w:fill="1F2A3C" w:color="auto" w:val="clear"/>
+            <w:tcMar>
+              <w:top w:type="dxa" w:w="70"/>
+              <w:left w:type="dxa" w:w="110"/>
+              <w:bottom w:type="dxa" w:w="70"/>
+              <w:right w:type="dxa" w:w="110"/>
+            </w:tcMar>
+            <w:vAlign w:val="top"/>
+          </w:tcPr>
+          <w:p>
+            <w:r>
+              <w:rPr>
+                <w:b/>
+                <w:bCs/>
+                <w:color w:val="FFFFFF"/>
+              </w:rPr>
+              <w:t xml:space="preserve">O que diz</w:t>
+            </w:r>
+          </w:p>
+        </w:tc>
+      </w:tr>
+      <w:tr>
+        <w:trPr>
+          <w:trHeight w:val="480" w:hRule="atLeast"/>
+        </w:trPr>
+        <w:tc>
+          <w:tcPr>
+            <w:tcW w:type="dxa" w:w="3600"/>
+            <w:tcBorders>
+              <w:top w:val="single" w:color="BFC9D1" w:sz="4"/>
+              <w:left w:val="single" w:color="BFC9D1" w:sz="4"/>
+              <w:bottom w:val="single" w:color="BFC9D1" w:sz="4"/>
+              <w:right w:val="single" w:color="BFC9D1" w:sz="4"/>
+            </w:tcBorders>
+            <w:tcMar>
+              <w:top w:type="dxa" w:w="70"/>
+              <w:left w:type="dxa" w:w="110"/>
+              <w:bottom w:type="dxa" w:w="70"/>
+              <w:right w:type="dxa" w:w="110"/>
+            </w:tcMar>
+            <w:vAlign w:val="top"/>
+          </w:tcPr>
+          <w:p>
+            <w:r>
+              <w:t xml:space="preserve">docs/historia/História_Completa.md, seção 4.1</w:t>
+            </w:r>
+          </w:p>
+        </w:tc>
+        <w:tc>
+          <w:tcPr>
+            <w:tcW w:type="dxa" w:w="5426"/>
+            <w:tcBorders>
+              <w:top w:val="single" w:color="BFC9D1" w:sz="4"/>
+              <w:left w:val="single" w:color="BFC9D1" w:sz="4"/>
+              <w:bottom w:val="single" w:color="BFC9D1" w:sz="4"/>
+              <w:right w:val="single" w:color="BFC9D1" w:sz="4"/>
+            </w:tcBorders>
+            <w:tcMar>
+              <w:top w:type="dxa" w:w="70"/>
+              <w:left w:type="dxa" w:w="110"/>
+              <w:bottom w:type="dxa" w:w="70"/>
+              <w:right w:type="dxa" w:w="110"/>
+            </w:tcMar>
+            <w:vAlign w:val="top"/>
+          </w:tcPr>
+          <w:p>
+            <w:r>
+              <w:t xml:space="preserve">Ordem: Henrique primeiro, Zane antes da Clarice, Diana depois da Clarice, Gabriel por último. Chegaram com 3 dias de intervalo. Baltazar pendente.</w:t>
+            </w:r>
+          </w:p>
+        </w:tc>
+      </w:tr>
+      <w:tr>
+        <w:trPr>
+          <w:trHeight w:val="480" w:hRule="atLeast"/>
+        </w:trPr>
+        <w:tc>
+          <w:tcPr>
+            <w:tcW w:type="dxa" w:w="3600"/>
+            <w:tcBorders>
+              <w:top w:val="single" w:color="BFC9D1" w:sz="4"/>
+              <w:left w:val="single" w:color="BFC9D1" w:sz="4"/>
+              <w:bottom w:val="single" w:color="BFC9D1" w:sz="4"/>
+              <w:right w:val="single" w:color="BFC9D1" w:sz="4"/>
+            </w:tcBorders>
+            <w:tcMar>
+              <w:top w:type="dxa" w:w="70"/>
+              <w:left w:type="dxa" w:w="110"/>
+              <w:bottom w:type="dxa" w:w="70"/>
+              <w:right w:type="dxa" w:w="110"/>
+            </w:tcMar>
+            <w:vAlign w:val="top"/>
+          </w:tcPr>
+          <w:p>
+            <w:r>
+              <w:t xml:space="preserve">docs/historia/História_Completa.md, seção 7.2, item 5</w:t>
+            </w:r>
+          </w:p>
+        </w:tc>
+        <w:tc>
+          <w:tcPr>
+            <w:tcW w:type="dxa" w:w="5426"/>
+            <w:tcBorders>
+              <w:top w:val="single" w:color="BFC9D1" w:sz="4"/>
+              <w:left w:val="single" w:color="BFC9D1" w:sz="4"/>
+              <w:bottom w:val="single" w:color="BFC9D1" w:sz="4"/>
+              <w:right w:val="single" w:color="BFC9D1" w:sz="4"/>
+            </w:tcBorders>
+            <w:tcMar>
+              <w:top w:type="dxa" w:w="70"/>
+              <w:left w:type="dxa" w:w="110"/>
+              <w:bottom w:type="dxa" w:w="70"/>
+              <w:right w:type="dxa" w:w="110"/>
+            </w:tcMar>
+            <w:vAlign w:val="top"/>
+          </w:tcPr>
+          <w:p>
+            <w:r>
+              <w:t xml:space="preserve">Os outros pulsos, com 3 dias de intervalo. Zane antes da Clarice, Diana depois.</w:t>
+            </w:r>
+          </w:p>
+        </w:tc>
+      </w:tr>
+      <w:tr>
+        <w:trPr>
+          <w:trHeight w:val="480" w:hRule="atLeast"/>
+        </w:trPr>
+        <w:tc>
+          <w:tcPr>
+            <w:tcW w:type="dxa" w:w="3600"/>
+            <w:tcBorders>
+              <w:top w:val="single" w:color="BFC9D1" w:sz="4"/>
+              <w:left w:val="single" w:color="BFC9D1" w:sz="4"/>
+              <w:bottom w:val="single" w:color="BFC9D1" w:sz="4"/>
+              <w:right w:val="single" w:color="BFC9D1" w:sz="4"/>
+            </w:tcBorders>
+            <w:tcMar>
+              <w:top w:type="dxa" w:w="70"/>
+              <w:left w:type="dxa" w:w="110"/>
+              <w:bottom w:type="dxa" w:w="70"/>
+              <w:right w:type="dxa" w:w="110"/>
+            </w:tcMar>
+            <w:vAlign w:val="top"/>
+          </w:tcPr>
+          <w:p>
+            <w:r>
+              <w:t xml:space="preserve">docs/historia/História_Completa.md, seção 10.4</w:t>
+            </w:r>
+          </w:p>
+        </w:tc>
+        <w:tc>
+          <w:tcPr>
+            <w:tcW w:type="dxa" w:w="5426"/>
+            <w:tcBorders>
+              <w:top w:val="single" w:color="BFC9D1" w:sz="4"/>
+              <w:left w:val="single" w:color="BFC9D1" w:sz="4"/>
+              <w:bottom w:val="single" w:color="BFC9D1" w:sz="4"/>
+              <w:right w:val="single" w:color="BFC9D1" w:sz="4"/>
+            </w:tcBorders>
+            <w:tcMar>
+              <w:top w:type="dxa" w:w="70"/>
+              <w:left w:type="dxa" w:w="110"/>
+              <w:bottom w:type="dxa" w:w="70"/>
+              <w:right w:type="dxa" w:w="110"/>
+            </w:tcMar>
+            <w:vAlign w:val="top"/>
+          </w:tcPr>
+          <w:p>
+            <w:r>
+              <w:t xml:space="preserve">Pendência: a posição do Baltazar na ordem e a sala dele na Biblioteca.</w:t>
+            </w:r>
+          </w:p>
+        </w:tc>
+      </w:tr>
+      <w:tr>
+        <w:trPr>
+          <w:trHeight w:val="480" w:hRule="atLeast"/>
+        </w:trPr>
+        <w:tc>
+          <w:tcPr>
+            <w:tcW w:type="dxa" w:w="3600"/>
+            <w:tcBorders>
+              <w:top w:val="single" w:color="BFC9D1" w:sz="4"/>
+              <w:left w:val="single" w:color="BFC9D1" w:sz="4"/>
+              <w:bottom w:val="single" w:color="BFC9D1" w:sz="4"/>
+              <w:right w:val="single" w:color="BFC9D1" w:sz="4"/>
+            </w:tcBorders>
+            <w:tcMar>
+              <w:top w:type="dxa" w:w="70"/>
+              <w:left w:type="dxa" w:w="110"/>
+              <w:bottom w:type="dxa" w:w="70"/>
+              <w:right w:type="dxa" w:w="110"/>
+            </w:tcMar>
+            <w:vAlign w:val="top"/>
+          </w:tcPr>
+          <w:p>
+            <w:r>
+              <w:t xml:space="preserve">docs/historia/personagens/ (henrique, zane, diana, resumo)</w:t>
+            </w:r>
+          </w:p>
+        </w:tc>
+        <w:tc>
+          <w:tcPr>
+            <w:tcW w:type="dxa" w:w="5426"/>
+            <w:tcBorders>
+              <w:top w:val="single" w:color="BFC9D1" w:sz="4"/>
+              <w:left w:val="single" w:color="BFC9D1" w:sz="4"/>
+              <w:bottom w:val="single" w:color="BFC9D1" w:sz="4"/>
+              <w:right w:val="single" w:color="BFC9D1" w:sz="4"/>
+            </w:tcBorders>
+            <w:tcMar>
+              <w:top w:type="dxa" w:w="70"/>
+              <w:left w:type="dxa" w:w="110"/>
+              <w:bottom w:type="dxa" w:w="70"/>
+              <w:right w:type="dxa" w:w="110"/>
+            </w:tcMar>
+            <w:vAlign w:val="top"/>
+          </w:tcPr>
+          <w:p>
+            <w:r>
+              <w:t xml:space="preserve">Repetem a ordem. O resumo diz que só falta o Baltazar.</w:t>
+            </w:r>
+          </w:p>
+        </w:tc>
+      </w:tr>
+      <w:tr>
+        <w:trPr>
+          <w:trHeight w:val="480" w:hRule="atLeast"/>
+        </w:trPr>
+        <w:tc>
+          <w:tcPr>
+            <w:tcW w:type="dxa" w:w="3600"/>
+            <w:tcBorders>
+              <w:top w:val="single" w:color="BFC9D1" w:sz="4"/>
+              <w:left w:val="single" w:color="BFC9D1" w:sz="4"/>
+              <w:bottom w:val="single" w:color="BFC9D1" w:sz="4"/>
+              <w:right w:val="single" w:color="BFC9D1" w:sz="4"/>
+            </w:tcBorders>
+            <w:tcMar>
+              <w:top w:type="dxa" w:w="70"/>
+              <w:left w:type="dxa" w:w="110"/>
+              <w:bottom w:type="dxa" w:w="70"/>
+              <w:right w:type="dxa" w:w="110"/>
+            </w:tcMar>
+            <w:vAlign w:val="top"/>
+          </w:tcPr>
+          <w:p>
+            <w:r>
+              <w:t xml:space="preserve">docs/decisoes.md, 2026-10-11 e 2026-10-08</w:t>
+            </w:r>
+          </w:p>
+        </w:tc>
+        <w:tc>
+          <w:tcPr>
+            <w:tcW w:type="dxa" w:w="5426"/>
+            <w:tcBorders>
+              <w:top w:val="single" w:color="BFC9D1" w:sz="4"/>
+              <w:left w:val="single" w:color="BFC9D1" w:sz="4"/>
+              <w:bottom w:val="single" w:color="BFC9D1" w:sz="4"/>
+              <w:right w:val="single" w:color="BFC9D1" w:sz="4"/>
+            </w:tcBorders>
+            <w:tcMar>
+              <w:top w:type="dxa" w:w="70"/>
+              <w:left w:type="dxa" w:w="110"/>
+              <w:bottom w:type="dxa" w:w="70"/>
+              <w:right w:type="dxa" w:w="110"/>
+            </w:tcMar>
+            <w:vAlign w:val="top"/>
+          </w:tcPr>
+          <w:p>
+            <w:r>
+              <w:t xml:space="preserve">Onde a ordem foi fechada (Henrique primeiro; Zane antes da Clarice). Uma entrada de 2026-10-06 ainda diz que o Zane era o último, e está superada.</w:t>
+            </w:r>
+          </w:p>
+        </w:tc>
+      </w:tr>
+      <w:tr>
+        <w:trPr>
+          <w:trHeight w:val="480" w:hRule="atLeast"/>
+        </w:trPr>
+        <w:tc>
+          <w:tcPr>
+            <w:tcW w:type="dxa" w:w="3600"/>
+            <w:tcBorders>
+              <w:top w:val="single" w:color="BFC9D1" w:sz="4"/>
+              <w:left w:val="single" w:color="BFC9D1" w:sz="4"/>
+              <w:bottom w:val="single" w:color="BFC9D1" w:sz="4"/>
+              <w:right w:val="single" w:color="BFC9D1" w:sz="4"/>
+            </w:tcBorders>
+            <w:tcMar>
+              <w:top w:type="dxa" w:w="70"/>
+              <w:left w:type="dxa" w:w="110"/>
+              <w:bottom w:type="dxa" w:w="70"/>
+              <w:right w:type="dxa" w:w="110"/>
+            </w:tcMar>
+            <w:vAlign w:val="top"/>
+          </w:tcPr>
+          <w:p>
+            <w:r>
+              <w:t xml:space="preserve">docs/decisoes.md, 2026-10-18</w:t>
+            </w:r>
+          </w:p>
+        </w:tc>
+        <w:tc>
+          <w:tcPr>
+            <w:tcW w:type="dxa" w:w="5426"/>
+            <w:tcBorders>
+              <w:top w:val="single" w:color="BFC9D1" w:sz="4"/>
+              <w:left w:val="single" w:color="BFC9D1" w:sz="4"/>
+              <w:bottom w:val="single" w:color="BFC9D1" w:sz="4"/>
+              <w:right w:val="single" w:color="BFC9D1" w:sz="4"/>
+            </w:tcBorders>
+            <w:tcMar>
+              <w:top w:type="dxa" w:w="70"/>
+              <w:left w:type="dxa" w:w="110"/>
+              <w:bottom w:type="dxa" w:w="70"/>
+              <w:right w:type="dxa" w:w="110"/>
+            </w:tcMar>
+            <w:vAlign w:val="top"/>
+          </w:tcPr>
+          <w:p>
+            <w:r>
+              <w:t xml:space="preserve">Os 3 dias de intervalo.</w:t>
+            </w:r>
+          </w:p>
+        </w:tc>
+      </w:tr>
+    </w:tbl>
+    <w:p>
+      <w:pPr>
+        <w:spacing w:after="120" w:before="100"/>
+      </w:pPr>
+      <w:r>
+        <w:t xml:space="preserve">Falta definir a posição do Baltazar na ordem. Ela decide quantos dias cada um está lá.</w:t>
       </w:r>
     </w:p>
     <w:p>
@@ -39870,6 +40269,103 @@
       </w:tr>
       <w:tr>
         <w:trPr>
+          <w:trHeight w:val="480" w:hRule="atLeast"/>
+        </w:trPr>
+        <w:tc>
+          <w:tcPr>
+            <w:tcW w:type="dxa" w:w="1100"/>
+            <w:tcBorders>
+              <w:top w:val="single" w:color="BFC9D1" w:sz="4"/>
+              <w:left w:val="single" w:color="BFC9D1" w:sz="4"/>
+              <w:bottom w:val="single" w:color="BFC9D1" w:sz="4"/>
+              <w:right w:val="single" w:color="BFC9D1" w:sz="4"/>
+            </w:tcBorders>
+            <w:tcMar>
+              <w:top w:type="dxa" w:w="70"/>
+              <w:left w:type="dxa" w:w="110"/>
+              <w:bottom w:type="dxa" w:w="70"/>
+              <w:right w:type="dxa" w:w="110"/>
+            </w:tcMar>
+            <w:vAlign w:val="top"/>
+          </w:tcPr>
+          <w:p>
+            <w:r>
+              <w:t xml:space="preserve">0.7</w:t>
+            </w:r>
+          </w:p>
+        </w:tc>
+        <w:tc>
+          <w:tcPr>
+            <w:tcW w:type="dxa" w:w="1400"/>
+            <w:tcBorders>
+              <w:top w:val="single" w:color="BFC9D1" w:sz="4"/>
+              <w:left w:val="single" w:color="BFC9D1" w:sz="4"/>
+              <w:bottom w:val="single" w:color="BFC9D1" w:sz="4"/>
+              <w:right w:val="single" w:color="BFC9D1" w:sz="4"/>
+            </w:tcBorders>
+            <w:tcMar>
+              <w:top w:type="dxa" w:w="70"/>
+              <w:left w:type="dxa" w:w="110"/>
+              <w:bottom w:type="dxa" w:w="70"/>
+              <w:right w:type="dxa" w:w="110"/>
+            </w:tcMar>
+            <w:vAlign w:val="top"/>
+          </w:tcPr>
+          <w:p>
+            <w:r>
+              <w:t xml:space="preserve">18/10/2026</w:t>
+            </w:r>
+          </w:p>
+        </w:tc>
+        <w:tc>
+          <w:tcPr>
+            <w:tcW w:type="dxa" w:w="2000"/>
+            <w:tcBorders>
+              <w:top w:val="single" w:color="BFC9D1" w:sz="4"/>
+              <w:left w:val="single" w:color="BFC9D1" w:sz="4"/>
+              <w:bottom w:val="single" w:color="BFC9D1" w:sz="4"/>
+              <w:right w:val="single" w:color="BFC9D1" w:sz="4"/>
+            </w:tcBorders>
+            <w:tcMar>
+              <w:top w:type="dxa" w:w="70"/>
+              <w:left w:type="dxa" w:w="110"/>
+              <w:bottom w:type="dxa" w:w="70"/>
+              <w:right w:type="dxa" w:w="110"/>
+            </w:tcMar>
+            <w:vAlign w:val="top"/>
+          </w:tcPr>
+          <w:p>
+            <w:r>
+              <w:t xml:space="preserve"/>
+            </w:r>
+          </w:p>
+        </w:tc>
+        <w:tc>
+          <w:tcPr>
+            <w:tcW w:type="dxa" w:w="4526"/>
+            <w:tcBorders>
+              <w:top w:val="single" w:color="BFC9D1" w:sz="4"/>
+              <w:left w:val="single" w:color="BFC9D1" w:sz="4"/>
+              <w:bottom w:val="single" w:color="BFC9D1" w:sz="4"/>
+              <w:right w:val="single" w:color="BFC9D1" w:sz="4"/>
+            </w:tcBorders>
+            <w:tcMar>
+              <w:top w:type="dxa" w:w="70"/>
+              <w:left w:type="dxa" w:w="110"/>
+              <w:bottom w:type="dxa" w:w="70"/>
+              <w:right w:type="dxa" w:w="110"/>
+            </w:tcMar>
+            <w:vAlign w:val="top"/>
+          </w:tcPr>
+          <w:p>
+            <w:r>
+              <w:t xml:space="preserve">Cena 2.2 sem ramo, com a fala longa quebrada e os dias da Clarice; ordem de chegada no Anexo B.</w:t>
+            </w:r>
+          </w:p>
+        </w:tc>
+      </w:tr>
+      <w:tr>
+        <w:trPr>
           <w:trHeight w:val="560" w:hRule="atLeast"/>
         </w:trPr>
         <w:tc>
@@ -40126,7 +40622,7 @@
         <w:sz w:val="17"/>
         <w:szCs w:val="17"/>
       </w:rPr>
-      <w:t xml:space="preserve">Versão 0.6 — Rascunho</w:t>
+      <w:t xml:space="preserve">Versão 0.7 — Rascunho</w:t>
     </w:r>
     <w:r>
       <w:rPr>

</xml_diff>